<commit_message>
fix: clarified rule about dry-weight and expanded CEP section
</commit_message>
<xml_diff>
--- a/predlog_projekta/FlightForge.docx
+++ b/predlog_projekta/FlightForge.docx
@@ -17,6 +17,7 @@
         </w:rPr>
       </w:pPr>
       <w:bookmarkStart w:id="0" w:name="X8fe79f0d20b0021fac93a6ba66099f91d9fe3c9"/>
+      <w:proofErr w:type="spellStart"/>
       <w:r>
         <w:rPr>
           <w:rFonts w:ascii="Roboto" w:hAnsi="Roboto"/>
@@ -26,7 +27,19 @@
           <w:szCs w:val="28"/>
           <w:lang w:val="sr-Latn-RS"/>
         </w:rPr>
-        <w:t>FlightForge — Sistemi bazirani na znanju, predlog projekta</w:t>
+        <w:t>FlightForge</w:t>
+      </w:r>
+      <w:proofErr w:type="spellEnd"/>
+      <w:r>
+        <w:rPr>
+          <w:rFonts w:ascii="Roboto" w:hAnsi="Roboto"/>
+          <w:b/>
+          <w:bCs/>
+          <w:sz w:val="28"/>
+          <w:szCs w:val="28"/>
+          <w:lang w:val="sr-Latn-RS"/>
+        </w:rPr>
+        <w:t xml:space="preserve"> — Sistemi bazirani na znanju, predlog projekta</w:t>
       </w:r>
     </w:p>
     <w:p>
@@ -113,16 +126,49 @@
           <w:szCs w:val="22"/>
           <w:lang w:val="sr-Latn-RS"/>
         </w:rPr>
-        <w:t>radio controlled</w:t>
-      </w:r>
-      <w:r>
-        <w:rPr>
-          <w:rFonts w:ascii="Roboto" w:hAnsi="Roboto"/>
-          <w:sz w:val="22"/>
-          <w:szCs w:val="22"/>
-          <w:lang w:val="sr-Latn-RS"/>
-        </w:rPr>
-        <w:t>) avio modelarstvo je posebno kompleksno jer pored izrade samog aviona takođe uključuje poznavanje komponenti kao što su radio stanice, prijemnici, ESC, BEC, baterije, propeleri, brushless i servo motori. Izbor komponenti je kompleksan zadatak, zahteva obimno znanje o njihovim osobinama ali i načinu na koji komponente zavise međusobno jedna od druge. Čak i za iskusne modelare ovo planiranje je zahtevan proces koji bi se mogao značajno olakšati korišćenjem specijalizovane aplikacije.</w:t>
+        <w:t xml:space="preserve">radio </w:t>
+      </w:r>
+      <w:proofErr w:type="spellStart"/>
+      <w:r>
+        <w:rPr>
+          <w:rFonts w:ascii="Roboto" w:hAnsi="Roboto"/>
+          <w:i/>
+          <w:iCs/>
+          <w:sz w:val="22"/>
+          <w:szCs w:val="22"/>
+          <w:lang w:val="sr-Latn-RS"/>
+        </w:rPr>
+        <w:t>controlled</w:t>
+      </w:r>
+      <w:proofErr w:type="spellEnd"/>
+      <w:r>
+        <w:rPr>
+          <w:rFonts w:ascii="Roboto" w:hAnsi="Roboto"/>
+          <w:sz w:val="22"/>
+          <w:szCs w:val="22"/>
+          <w:lang w:val="sr-Latn-RS"/>
+        </w:rPr>
+        <w:t xml:space="preserve">) avio modelarstvo je posebno kompleksno jer pored izrade samog aviona takođe uključuje poznavanje komponenti kao što su radio stanice, prijemnici, ESC, BEC, baterije, propeleri, </w:t>
+      </w:r>
+      <w:proofErr w:type="spellStart"/>
+      <w:r>
+        <w:rPr>
+          <w:rFonts w:ascii="Roboto" w:hAnsi="Roboto"/>
+          <w:sz w:val="22"/>
+          <w:szCs w:val="22"/>
+          <w:lang w:val="sr-Latn-RS"/>
+        </w:rPr>
+        <w:t>brushless</w:t>
+      </w:r>
+      <w:proofErr w:type="spellEnd"/>
+      <w:r>
+        <w:rPr>
+          <w:rFonts w:ascii="Roboto" w:hAnsi="Roboto"/>
+          <w:sz w:val="22"/>
+          <w:szCs w:val="22"/>
+          <w:lang w:val="sr-Latn-RS"/>
+        </w:rPr>
+        <w:t xml:space="preserve"> i servo motori. Izbor komponenti je kompleksan zadatak, zahteva obimno znanje o njihovim osobinama ali i načinu na koji komponente zavise međusobno jedna od druge. Čak i za iskusne modelare ovo planiranje je zahtevan proces koji bi se mogao značajno olakšati korišćenjem specijalizovane aplikacije.</w:t>
       </w:r>
     </w:p>
     <w:p>
@@ -169,8 +215,19 @@
           <w:szCs w:val="22"/>
           <w:lang w:val="sr-Latn-RS"/>
         </w:rPr>
-        <w:t>Prvi izazov kod RC avio modelarstva jeste odabir modela i nalaženje njegovih planova, ali takođe i izbor adekvatne elektronike za taj model. Jedan od najvećih izvora besplatnih planova za RC avio modele jeste FliteTest</w:t>
-      </w:r>
+        <w:t xml:space="preserve">Prvi izazov kod RC avio modelarstva jeste odabir modela i nalaženje njegovih planova, ali takođe i izbor adekvatne elektronike za taj model. Jedan od najvećih izvora besplatnih planova za RC avio modele jeste </w:t>
+      </w:r>
+      <w:proofErr w:type="spellStart"/>
+      <w:r>
+        <w:rPr>
+          <w:rFonts w:ascii="Roboto" w:hAnsi="Roboto"/>
+          <w:sz w:val="22"/>
+          <w:szCs w:val="22"/>
+          <w:lang w:val="sr-Latn-RS"/>
+        </w:rPr>
+        <w:t>FliteTest</w:t>
+      </w:r>
+      <w:proofErr w:type="spellEnd"/>
       <w:r>
         <w:rPr>
           <w:rFonts w:ascii="Roboto" w:hAnsi="Roboto"/>
@@ -328,6 +385,7 @@
         </w:rPr>
         <w:t xml:space="preserve"> i njihova zajednica. Ovi modeli se pretežno baziraju na korišćenju karton pene (eng. </w:t>
       </w:r>
+      <w:proofErr w:type="spellStart"/>
       <w:r>
         <w:rPr>
           <w:rFonts w:ascii="Roboto" w:hAnsi="Roboto"/>
@@ -339,14 +397,55 @@
         </w:rPr>
         <w:t>foamboard</w:t>
       </w:r>
-      <w:r>
-        <w:rPr>
-          <w:rFonts w:ascii="Roboto" w:hAnsi="Roboto"/>
-          <w:sz w:val="22"/>
-          <w:szCs w:val="22"/>
-          <w:lang w:val="sr-Latn-RS"/>
-        </w:rPr>
-        <w:t>) kao osnovnog gradivnog materijala. Ovo je dodatni izazov jer je izbor karton pene kod nas veoma ograničen. Ona se uglavnom koristi za izradu reklamnih rekvizita, te zbog toga nije uopšte optimizovana za težinu. Pošto se prodaje u velikim pločama, za razliku od elektronskih komponenti, njeno poručivanje iz inostranstva nije isplativo. Jedina realna opcija jeste lokalna ponuda, gde su ploče nekad za istu površinu i debljinu duplo teže od onih za koje su FliteTest planovi originalno kreirani. Ovo dodatno komplikuje planiranje jer da bi se održao balans, model je tada potrebno skalirati. Izazov izbora komponenti nije samo njihova međusobna kompatibilnost, već i činjenica da teži model zahteva snažnije komponente. Snažnije komponente su takođe i teže, povećavajući masu modela i zahtevajući ponovo snažnije komponente… Dakle neophodno je ostvariti adekvatan odnos težine i potiska modela. Isto tako bitan faktor za procenu jeste minimalno trajanje leta pod punim opterećenjem. Naravno, ovo podrazumeva da odabrana kombinacija komponenti može izdržati puno opterećenje. Iako na internetu postoje kalkulatori koji rešavaju jednostavne probleme</w:t>
+      <w:proofErr w:type="spellEnd"/>
+      <w:r>
+        <w:rPr>
+          <w:rFonts w:ascii="Roboto" w:hAnsi="Roboto"/>
+          <w:sz w:val="22"/>
+          <w:szCs w:val="22"/>
+          <w:lang w:val="sr-Latn-RS"/>
+        </w:rPr>
+        <w:t xml:space="preserve">) kao osnovnog gradivnog materijala. Ovo je dodatni izazov jer je izbor karton pene kod nas veoma ograničen. Ona se uglavnom koristi za izradu reklamnih rekvizita, te zbog toga nije uopšte optimizovana za težinu. Pošto se prodaje u velikim pločama, za razliku od elektronskih komponenti, njeno poručivanje iz inostranstva nije isplativo. Jedina realna opcija jeste lokalna ponuda, gde su ploče nekad za istu površinu i debljinu duplo teže od onih za koje su </w:t>
+      </w:r>
+      <w:proofErr w:type="spellStart"/>
+      <w:r>
+        <w:rPr>
+          <w:rFonts w:ascii="Roboto" w:hAnsi="Roboto"/>
+          <w:sz w:val="22"/>
+          <w:szCs w:val="22"/>
+          <w:lang w:val="sr-Latn-RS"/>
+        </w:rPr>
+        <w:t>FliteTest</w:t>
+      </w:r>
+      <w:proofErr w:type="spellEnd"/>
+      <w:r>
+        <w:rPr>
+          <w:rFonts w:ascii="Roboto" w:hAnsi="Roboto"/>
+          <w:sz w:val="22"/>
+          <w:szCs w:val="22"/>
+          <w:lang w:val="sr-Latn-RS"/>
+        </w:rPr>
+        <w:t xml:space="preserve"> planovi originalno kreirani. Ovo dodatno komplikuje planiranje jer da bi se održao balans, model je tada potrebno </w:t>
+      </w:r>
+      <w:proofErr w:type="spellStart"/>
+      <w:r>
+        <w:rPr>
+          <w:rFonts w:ascii="Roboto" w:hAnsi="Roboto"/>
+          <w:sz w:val="22"/>
+          <w:szCs w:val="22"/>
+          <w:lang w:val="sr-Latn-RS"/>
+        </w:rPr>
+        <w:t>skalirati</w:t>
+      </w:r>
+      <w:proofErr w:type="spellEnd"/>
+      <w:r>
+        <w:rPr>
+          <w:rFonts w:ascii="Roboto" w:hAnsi="Roboto"/>
+          <w:sz w:val="22"/>
+          <w:szCs w:val="22"/>
+          <w:lang w:val="sr-Latn-RS"/>
+        </w:rPr>
+        <w:t>. Izazov izbora komponenti nije samo njihova međusobna kompatibilnost, već i činjenica da teži model zahteva snažnije komponente. Snažnije komponente su takođe i teže, povećavajući masu modela i zahtevajući ponovo snažnije komponente… Dakle neophodno je ostvariti adekvatan odnos težine i potiska modela. Isto tako bitan faktor za procenu jeste minimalno trajanje leta pod punim opterećenjem. Naravno, ovo podrazumeva da odabrana kombinacija komponenti može izdržati puno opterećenje. Iako na internetu postoje kalkulatori koji rešavaju jednostavne probleme</w:t>
       </w:r>
       <w:r>
         <w:rPr>
@@ -650,7 +749,27 @@
           <w:szCs w:val="22"/>
           <w:lang w:val="sr-Latn-RS"/>
         </w:rPr>
-        <w:t>Faktor skaliranja modela (skaliranje dužine i širine, ne površine)</w:t>
+        <w:t xml:space="preserve">Faktor </w:t>
+      </w:r>
+      <w:proofErr w:type="spellStart"/>
+      <w:r>
+        <w:rPr>
+          <w:rFonts w:ascii="Roboto" w:hAnsi="Roboto"/>
+          <w:sz w:val="22"/>
+          <w:szCs w:val="22"/>
+          <w:lang w:val="sr-Latn-RS"/>
+        </w:rPr>
+        <w:t>skaliranja</w:t>
+      </w:r>
+      <w:proofErr w:type="spellEnd"/>
+      <w:r>
+        <w:rPr>
+          <w:rFonts w:ascii="Roboto" w:hAnsi="Roboto"/>
+          <w:sz w:val="22"/>
+          <w:szCs w:val="22"/>
+          <w:lang w:val="sr-Latn-RS"/>
+        </w:rPr>
+        <w:t xml:space="preserve"> modela (skaliranje dužine i širine, ne površine)</w:t>
       </w:r>
     </w:p>
     <w:p>
@@ -728,7 +847,47 @@
           <w:szCs w:val="21"/>
           <w:lang w:val="sr-Latn-RS"/>
         </w:rPr>
-        <w:t>Prioritet prilikom traženja kombinacije (min. cena / min. težina / max. vreme leta / max. T/W faktor)</w:t>
+        <w:t xml:space="preserve">Prioritet prilikom traženja kombinacije (min. cena / min. težina / </w:t>
+      </w:r>
+      <w:proofErr w:type="spellStart"/>
+      <w:r>
+        <w:rPr>
+          <w:rFonts w:ascii="Roboto" w:hAnsi="Roboto"/>
+          <w:sz w:val="21"/>
+          <w:szCs w:val="21"/>
+          <w:lang w:val="sr-Latn-RS"/>
+        </w:rPr>
+        <w:t>max</w:t>
+      </w:r>
+      <w:proofErr w:type="spellEnd"/>
+      <w:r>
+        <w:rPr>
+          <w:rFonts w:ascii="Roboto" w:hAnsi="Roboto"/>
+          <w:sz w:val="21"/>
+          <w:szCs w:val="21"/>
+          <w:lang w:val="sr-Latn-RS"/>
+        </w:rPr>
+        <w:t xml:space="preserve">. vreme leta / </w:t>
+      </w:r>
+      <w:proofErr w:type="spellStart"/>
+      <w:r>
+        <w:rPr>
+          <w:rFonts w:ascii="Roboto" w:hAnsi="Roboto"/>
+          <w:sz w:val="21"/>
+          <w:szCs w:val="21"/>
+          <w:lang w:val="sr-Latn-RS"/>
+        </w:rPr>
+        <w:t>max</w:t>
+      </w:r>
+      <w:proofErr w:type="spellEnd"/>
+      <w:r>
+        <w:rPr>
+          <w:rFonts w:ascii="Roboto" w:hAnsi="Roboto"/>
+          <w:sz w:val="21"/>
+          <w:szCs w:val="21"/>
+          <w:lang w:val="sr-Latn-RS"/>
+        </w:rPr>
+        <w:t>. T/W faktor)</w:t>
       </w:r>
     </w:p>
     <w:p>
@@ -1029,14 +1188,45 @@
           <w:lang w:val="sr-Latn-RS"/>
         </w:rPr>
       </w:pPr>
-      <w:r>
-        <w:rPr>
-          <w:rFonts w:ascii="Roboto" w:hAnsi="Roboto"/>
-          <w:sz w:val="22"/>
-          <w:szCs w:val="22"/>
-          <w:lang w:val="sr-Latn-RS"/>
-        </w:rPr>
-        <w:t>Wing loading — odnos ukupne težine modela i površine krila</w:t>
+      <w:proofErr w:type="spellStart"/>
+      <w:r>
+        <w:rPr>
+          <w:rFonts w:ascii="Roboto" w:hAnsi="Roboto"/>
+          <w:sz w:val="22"/>
+          <w:szCs w:val="22"/>
+          <w:lang w:val="sr-Latn-RS"/>
+        </w:rPr>
+        <w:t>Wing</w:t>
+      </w:r>
+      <w:proofErr w:type="spellEnd"/>
+      <w:r>
+        <w:rPr>
+          <w:rFonts w:ascii="Roboto" w:hAnsi="Roboto"/>
+          <w:sz w:val="22"/>
+          <w:szCs w:val="22"/>
+          <w:lang w:val="sr-Latn-RS"/>
+        </w:rPr>
+        <w:t xml:space="preserve"> </w:t>
+      </w:r>
+      <w:proofErr w:type="spellStart"/>
+      <w:r>
+        <w:rPr>
+          <w:rFonts w:ascii="Roboto" w:hAnsi="Roboto"/>
+          <w:sz w:val="22"/>
+          <w:szCs w:val="22"/>
+          <w:lang w:val="sr-Latn-RS"/>
+        </w:rPr>
+        <w:t>loading</w:t>
+      </w:r>
+      <w:proofErr w:type="spellEnd"/>
+      <w:r>
+        <w:rPr>
+          <w:rFonts w:ascii="Roboto" w:hAnsi="Roboto"/>
+          <w:sz w:val="22"/>
+          <w:szCs w:val="22"/>
+          <w:lang w:val="sr-Latn-RS"/>
+        </w:rPr>
+        <w:t xml:space="preserve"> — odnos ukupne težine modela i površine krila</w:t>
       </w:r>
     </w:p>
     <w:p>
@@ -1055,14 +1245,65 @@
           <w:lang w:val="sr-Latn-RS"/>
         </w:rPr>
       </w:pPr>
-      <w:r>
-        <w:rPr>
-          <w:rFonts w:ascii="Roboto" w:hAnsi="Roboto"/>
-          <w:sz w:val="22"/>
-          <w:szCs w:val="22"/>
-          <w:lang w:val="sr-Latn-RS"/>
-        </w:rPr>
-        <w:t>Wing cube loading (WCL faktor) — odnos ukupne težine modela i površine krila na 1.5 stepen</w:t>
+      <w:proofErr w:type="spellStart"/>
+      <w:r>
+        <w:rPr>
+          <w:rFonts w:ascii="Roboto" w:hAnsi="Roboto"/>
+          <w:sz w:val="22"/>
+          <w:szCs w:val="22"/>
+          <w:lang w:val="sr-Latn-RS"/>
+        </w:rPr>
+        <w:t>Wing</w:t>
+      </w:r>
+      <w:proofErr w:type="spellEnd"/>
+      <w:r>
+        <w:rPr>
+          <w:rFonts w:ascii="Roboto" w:hAnsi="Roboto"/>
+          <w:sz w:val="22"/>
+          <w:szCs w:val="22"/>
+          <w:lang w:val="sr-Latn-RS"/>
+        </w:rPr>
+        <w:t xml:space="preserve"> </w:t>
+      </w:r>
+      <w:proofErr w:type="spellStart"/>
+      <w:r>
+        <w:rPr>
+          <w:rFonts w:ascii="Roboto" w:hAnsi="Roboto"/>
+          <w:sz w:val="22"/>
+          <w:szCs w:val="22"/>
+          <w:lang w:val="sr-Latn-RS"/>
+        </w:rPr>
+        <w:t>cube</w:t>
+      </w:r>
+      <w:proofErr w:type="spellEnd"/>
+      <w:r>
+        <w:rPr>
+          <w:rFonts w:ascii="Roboto" w:hAnsi="Roboto"/>
+          <w:sz w:val="22"/>
+          <w:szCs w:val="22"/>
+          <w:lang w:val="sr-Latn-RS"/>
+        </w:rPr>
+        <w:t xml:space="preserve"> </w:t>
+      </w:r>
+      <w:proofErr w:type="spellStart"/>
+      <w:r>
+        <w:rPr>
+          <w:rFonts w:ascii="Roboto" w:hAnsi="Roboto"/>
+          <w:sz w:val="22"/>
+          <w:szCs w:val="22"/>
+          <w:lang w:val="sr-Latn-RS"/>
+        </w:rPr>
+        <w:t>loading</w:t>
+      </w:r>
+      <w:proofErr w:type="spellEnd"/>
+      <w:r>
+        <w:rPr>
+          <w:rFonts w:ascii="Roboto" w:hAnsi="Roboto"/>
+          <w:sz w:val="22"/>
+          <w:szCs w:val="22"/>
+          <w:lang w:val="sr-Latn-RS"/>
+        </w:rPr>
+        <w:t xml:space="preserve"> (WCL faktor) — odnos ukupne težine modela i površine krila na 1.5 stepen</w:t>
       </w:r>
     </w:p>
     <w:p>
@@ -1088,7 +1329,27 @@
           <w:szCs w:val="21"/>
           <w:lang w:val="sr-Latn-RS"/>
         </w:rPr>
-        <w:t>Ocena manevrabilnosti modela — na osnovu odnosa izračunatih i preporučenih T/W i WCL faktora</w:t>
+        <w:t xml:space="preserve">Ocena </w:t>
+      </w:r>
+      <w:proofErr w:type="spellStart"/>
+      <w:r>
+        <w:rPr>
+          <w:rFonts w:ascii="Roboto" w:hAnsi="Roboto"/>
+          <w:sz w:val="21"/>
+          <w:szCs w:val="21"/>
+          <w:lang w:val="sr-Latn-RS"/>
+        </w:rPr>
+        <w:t>manevrabilnosti</w:t>
+      </w:r>
+      <w:proofErr w:type="spellEnd"/>
+      <w:r>
+        <w:rPr>
+          <w:rFonts w:ascii="Roboto" w:hAnsi="Roboto"/>
+          <w:sz w:val="21"/>
+          <w:szCs w:val="21"/>
+          <w:lang w:val="sr-Latn-RS"/>
+        </w:rPr>
+        <w:t xml:space="preserve"> modela — na osnovu odnosa izračunatih i preporučenih T/W i WCL faktora</w:t>
       </w:r>
     </w:p>
     <w:p>
@@ -1240,7 +1501,27 @@
           <w:szCs w:val="22"/>
           <w:lang w:val="sr-Latn-RS"/>
         </w:rPr>
-        <w:t>Baza znanja obuhvata podatke o modelima aviona i elektronskim komponentama, kao i pravila koja određuju kompatibilnost izabranih komponenti, da li kombinacija odgovara modelu i da li je neki vremenski period prikladan za letenje sa kreiranim modelom. Inicijalna baza komponenti bila bi popunjena proizvodima sa HobbyKing-a</w:t>
+        <w:t xml:space="preserve">Baza znanja obuhvata podatke o modelima aviona i elektronskim komponentama, kao i pravila koja određuju kompatibilnost izabranih komponenti, da li kombinacija odgovara modelu i da li je neki vremenski period prikladan za letenje sa kreiranim modelom. Inicijalna baza komponenti bila bi popunjena proizvodima sa </w:t>
+      </w:r>
+      <w:proofErr w:type="spellStart"/>
+      <w:r>
+        <w:rPr>
+          <w:rFonts w:ascii="Roboto" w:hAnsi="Roboto"/>
+          <w:sz w:val="22"/>
+          <w:szCs w:val="22"/>
+          <w:lang w:val="sr-Latn-RS"/>
+        </w:rPr>
+        <w:t>HobbyKing</w:t>
+      </w:r>
+      <w:proofErr w:type="spellEnd"/>
+      <w:r>
+        <w:rPr>
+          <w:rFonts w:ascii="Roboto" w:hAnsi="Roboto"/>
+          <w:sz w:val="22"/>
+          <w:szCs w:val="22"/>
+          <w:lang w:val="sr-Latn-RS"/>
+        </w:rPr>
+        <w:t>-a</w:t>
       </w:r>
       <w:r>
         <w:rPr>
@@ -1374,6 +1655,7 @@
           <w:lang w:val="sr-Latn-RS"/>
         </w:rPr>
       </w:pPr>
+      <w:proofErr w:type="spellStart"/>
       <w:r>
         <w:rPr>
           <w:rFonts w:ascii="Roboto" w:hAnsi="Roboto"/>
@@ -1385,6 +1667,7 @@
         </w:rPr>
         <w:t>Airplane</w:t>
       </w:r>
+      <w:proofErr w:type="spellEnd"/>
     </w:p>
     <w:p>
       <w:pPr>
@@ -1454,14 +1737,25 @@
           <w:lang w:val="sr-Latn-RS"/>
         </w:rPr>
       </w:pPr>
-      <w:r>
-        <w:rPr>
-          <w:rFonts w:ascii="Roboto" w:hAnsi="Roboto"/>
-          <w:sz w:val="22"/>
-          <w:szCs w:val="22"/>
-          <w:lang w:val="sr-Latn-RS"/>
-        </w:rPr>
-        <w:t>wingspan — raspon krila</w:t>
+      <w:proofErr w:type="spellStart"/>
+      <w:r>
+        <w:rPr>
+          <w:rFonts w:ascii="Roboto" w:hAnsi="Roboto"/>
+          <w:sz w:val="22"/>
+          <w:szCs w:val="22"/>
+          <w:lang w:val="sr-Latn-RS"/>
+        </w:rPr>
+        <w:t>wingspan</w:t>
+      </w:r>
+      <w:proofErr w:type="spellEnd"/>
+      <w:r>
+        <w:rPr>
+          <w:rFonts w:ascii="Roboto" w:hAnsi="Roboto"/>
+          <w:sz w:val="22"/>
+          <w:szCs w:val="22"/>
+          <w:lang w:val="sr-Latn-RS"/>
+        </w:rPr>
+        <w:t xml:space="preserve"> — raspon krila</w:t>
       </w:r>
     </w:p>
     <w:p>
@@ -1480,14 +1774,25 @@
           <w:lang w:val="sr-Latn-RS"/>
         </w:rPr>
       </w:pPr>
-      <w:r>
-        <w:rPr>
-          <w:rFonts w:ascii="Roboto" w:hAnsi="Roboto"/>
-          <w:sz w:val="22"/>
-          <w:szCs w:val="22"/>
-          <w:lang w:val="sr-Latn-RS"/>
-        </w:rPr>
-        <w:t>wing area — površina krila</w:t>
+      <w:proofErr w:type="spellStart"/>
+      <w:r>
+        <w:rPr>
+          <w:rFonts w:ascii="Roboto" w:hAnsi="Roboto"/>
+          <w:sz w:val="22"/>
+          <w:szCs w:val="22"/>
+          <w:lang w:val="sr-Latn-RS"/>
+        </w:rPr>
+        <w:t>wing</w:t>
+      </w:r>
+      <w:proofErr w:type="spellEnd"/>
+      <w:r>
+        <w:rPr>
+          <w:rFonts w:ascii="Roboto" w:hAnsi="Roboto"/>
+          <w:sz w:val="22"/>
+          <w:szCs w:val="22"/>
+          <w:lang w:val="sr-Latn-RS"/>
+        </w:rPr>
+        <w:t xml:space="preserve"> area — površina krila</w:t>
       </w:r>
     </w:p>
     <w:p>
@@ -1506,14 +1811,45 @@
           <w:lang w:val="sr-Latn-RS"/>
         </w:rPr>
       </w:pPr>
-      <w:r>
-        <w:rPr>
-          <w:rFonts w:ascii="Roboto" w:hAnsi="Roboto"/>
-          <w:sz w:val="22"/>
-          <w:szCs w:val="22"/>
-          <w:lang w:val="sr-Latn-RS"/>
-        </w:rPr>
-        <w:t>wing loading — odnos težine modela i površine krila</w:t>
+      <w:proofErr w:type="spellStart"/>
+      <w:r>
+        <w:rPr>
+          <w:rFonts w:ascii="Roboto" w:hAnsi="Roboto"/>
+          <w:sz w:val="22"/>
+          <w:szCs w:val="22"/>
+          <w:lang w:val="sr-Latn-RS"/>
+        </w:rPr>
+        <w:t>wing</w:t>
+      </w:r>
+      <w:proofErr w:type="spellEnd"/>
+      <w:r>
+        <w:rPr>
+          <w:rFonts w:ascii="Roboto" w:hAnsi="Roboto"/>
+          <w:sz w:val="22"/>
+          <w:szCs w:val="22"/>
+          <w:lang w:val="sr-Latn-RS"/>
+        </w:rPr>
+        <w:t xml:space="preserve"> </w:t>
+      </w:r>
+      <w:proofErr w:type="spellStart"/>
+      <w:r>
+        <w:rPr>
+          <w:rFonts w:ascii="Roboto" w:hAnsi="Roboto"/>
+          <w:sz w:val="22"/>
+          <w:szCs w:val="22"/>
+          <w:lang w:val="sr-Latn-RS"/>
+        </w:rPr>
+        <w:t>loading</w:t>
+      </w:r>
+      <w:proofErr w:type="spellEnd"/>
+      <w:r>
+        <w:rPr>
+          <w:rFonts w:ascii="Roboto" w:hAnsi="Roboto"/>
+          <w:sz w:val="22"/>
+          <w:szCs w:val="22"/>
+          <w:lang w:val="sr-Latn-RS"/>
+        </w:rPr>
+        <w:t xml:space="preserve"> — odnos težine modela i površine krila</w:t>
       </w:r>
     </w:p>
     <w:p>
@@ -1532,14 +1868,65 @@
           <w:lang w:val="sr-Latn-RS"/>
         </w:rPr>
       </w:pPr>
-      <w:r>
-        <w:rPr>
-          <w:rFonts w:ascii="Roboto" w:hAnsi="Roboto"/>
-          <w:sz w:val="22"/>
-          <w:szCs w:val="22"/>
-          <w:lang w:val="sr-Latn-RS"/>
-        </w:rPr>
-        <w:t>wing cubic loading — kubno opterećenje krila, mera sposobnosti modela da leti sporo</w:t>
+      <w:proofErr w:type="spellStart"/>
+      <w:r>
+        <w:rPr>
+          <w:rFonts w:ascii="Roboto" w:hAnsi="Roboto"/>
+          <w:sz w:val="22"/>
+          <w:szCs w:val="22"/>
+          <w:lang w:val="sr-Latn-RS"/>
+        </w:rPr>
+        <w:t>wing</w:t>
+      </w:r>
+      <w:proofErr w:type="spellEnd"/>
+      <w:r>
+        <w:rPr>
+          <w:rFonts w:ascii="Roboto" w:hAnsi="Roboto"/>
+          <w:sz w:val="22"/>
+          <w:szCs w:val="22"/>
+          <w:lang w:val="sr-Latn-RS"/>
+        </w:rPr>
+        <w:t xml:space="preserve"> </w:t>
+      </w:r>
+      <w:proofErr w:type="spellStart"/>
+      <w:r>
+        <w:rPr>
+          <w:rFonts w:ascii="Roboto" w:hAnsi="Roboto"/>
+          <w:sz w:val="22"/>
+          <w:szCs w:val="22"/>
+          <w:lang w:val="sr-Latn-RS"/>
+        </w:rPr>
+        <w:t>cubic</w:t>
+      </w:r>
+      <w:proofErr w:type="spellEnd"/>
+      <w:r>
+        <w:rPr>
+          <w:rFonts w:ascii="Roboto" w:hAnsi="Roboto"/>
+          <w:sz w:val="22"/>
+          <w:szCs w:val="22"/>
+          <w:lang w:val="sr-Latn-RS"/>
+        </w:rPr>
+        <w:t xml:space="preserve"> </w:t>
+      </w:r>
+      <w:proofErr w:type="spellStart"/>
+      <w:r>
+        <w:rPr>
+          <w:rFonts w:ascii="Roboto" w:hAnsi="Roboto"/>
+          <w:sz w:val="22"/>
+          <w:szCs w:val="22"/>
+          <w:lang w:val="sr-Latn-RS"/>
+        </w:rPr>
+        <w:t>loading</w:t>
+      </w:r>
+      <w:proofErr w:type="spellEnd"/>
+      <w:r>
+        <w:rPr>
+          <w:rFonts w:ascii="Roboto" w:hAnsi="Roboto"/>
+          <w:sz w:val="22"/>
+          <w:szCs w:val="22"/>
+          <w:lang w:val="sr-Latn-RS"/>
+        </w:rPr>
+        <w:t xml:space="preserve"> — kubno opterećenje krila, mera sposobnosti modela da leti sporo</w:t>
       </w:r>
     </w:p>
     <w:p>
@@ -1584,14 +1971,45 @@
           <w:lang w:val="sr-Latn-RS"/>
         </w:rPr>
       </w:pPr>
-      <w:r>
-        <w:rPr>
-          <w:rFonts w:ascii="Roboto" w:hAnsi="Roboto"/>
-          <w:sz w:val="22"/>
-          <w:szCs w:val="22"/>
-          <w:lang w:val="sr-Latn-RS"/>
-        </w:rPr>
-        <w:t>dry weight — težina modela bez elektronskih komponenti</w:t>
+      <w:proofErr w:type="spellStart"/>
+      <w:r>
+        <w:rPr>
+          <w:rFonts w:ascii="Roboto" w:hAnsi="Roboto"/>
+          <w:sz w:val="22"/>
+          <w:szCs w:val="22"/>
+          <w:lang w:val="sr-Latn-RS"/>
+        </w:rPr>
+        <w:t>dry</w:t>
+      </w:r>
+      <w:proofErr w:type="spellEnd"/>
+      <w:r>
+        <w:rPr>
+          <w:rFonts w:ascii="Roboto" w:hAnsi="Roboto"/>
+          <w:sz w:val="22"/>
+          <w:szCs w:val="22"/>
+          <w:lang w:val="sr-Latn-RS"/>
+        </w:rPr>
+        <w:t xml:space="preserve"> </w:t>
+      </w:r>
+      <w:proofErr w:type="spellStart"/>
+      <w:r>
+        <w:rPr>
+          <w:rFonts w:ascii="Roboto" w:hAnsi="Roboto"/>
+          <w:sz w:val="22"/>
+          <w:szCs w:val="22"/>
+          <w:lang w:val="sr-Latn-RS"/>
+        </w:rPr>
+        <w:t>weight</w:t>
+      </w:r>
+      <w:proofErr w:type="spellEnd"/>
+      <w:r>
+        <w:rPr>
+          <w:rFonts w:ascii="Roboto" w:hAnsi="Roboto"/>
+          <w:sz w:val="22"/>
+          <w:szCs w:val="22"/>
+          <w:lang w:val="sr-Latn-RS"/>
+        </w:rPr>
+        <w:t xml:space="preserve"> — težina modela bez elektronskih komponenti</w:t>
       </w:r>
     </w:p>
     <w:p>
@@ -1610,14 +2028,65 @@
           <w:lang w:val="sr-Latn-RS"/>
         </w:rPr>
       </w:pPr>
-      <w:r>
-        <w:rPr>
-          <w:rFonts w:ascii="Roboto" w:hAnsi="Roboto"/>
-          <w:sz w:val="22"/>
-          <w:szCs w:val="22"/>
-          <w:lang w:val="sr-Latn-RS"/>
-        </w:rPr>
-        <w:t>all-up weight — ukupna težina modela sa predviđenim komponentama</w:t>
+      <w:proofErr w:type="spellStart"/>
+      <w:r>
+        <w:rPr>
+          <w:rFonts w:ascii="Roboto" w:hAnsi="Roboto"/>
+          <w:sz w:val="22"/>
+          <w:szCs w:val="22"/>
+          <w:lang w:val="sr-Latn-RS"/>
+        </w:rPr>
+        <w:t>all-up</w:t>
+      </w:r>
+      <w:proofErr w:type="spellEnd"/>
+      <w:r>
+        <w:rPr>
+          <w:rFonts w:ascii="Roboto" w:hAnsi="Roboto"/>
+          <w:sz w:val="22"/>
+          <w:szCs w:val="22"/>
+          <w:lang w:val="sr-Latn-RS"/>
+        </w:rPr>
+        <w:t xml:space="preserve"> </w:t>
+      </w:r>
+      <w:proofErr w:type="spellStart"/>
+      <w:r>
+        <w:rPr>
+          <w:rFonts w:ascii="Roboto" w:hAnsi="Roboto"/>
+          <w:sz w:val="22"/>
+          <w:szCs w:val="22"/>
+          <w:lang w:val="sr-Latn-RS"/>
+        </w:rPr>
+        <w:t>weight</w:t>
+      </w:r>
+      <w:proofErr w:type="spellEnd"/>
+      <w:r>
+        <w:rPr>
+          <w:rFonts w:ascii="Roboto" w:hAnsi="Roboto"/>
+          <w:sz w:val="22"/>
+          <w:szCs w:val="22"/>
+          <w:lang w:val="sr-Latn-RS"/>
+        </w:rPr>
+        <w:t xml:space="preserve"> — ukupna težina modela sa </w:t>
+      </w:r>
+      <w:proofErr w:type="spellStart"/>
+      <w:r>
+        <w:rPr>
+          <w:rFonts w:ascii="Roboto" w:hAnsi="Roboto"/>
+          <w:sz w:val="22"/>
+          <w:szCs w:val="22"/>
+          <w:lang w:val="sr-Latn-RS"/>
+        </w:rPr>
+        <w:t>predviđenim</w:t>
+      </w:r>
+      <w:proofErr w:type="spellEnd"/>
+      <w:r>
+        <w:rPr>
+          <w:rFonts w:ascii="Roboto" w:hAnsi="Roboto"/>
+          <w:sz w:val="22"/>
+          <w:szCs w:val="22"/>
+          <w:lang w:val="sr-Latn-RS"/>
+        </w:rPr>
+        <w:t xml:space="preserve"> komponentama</w:t>
       </w:r>
     </w:p>
     <w:p>
@@ -1643,7 +2112,67 @@
           <w:szCs w:val="22"/>
           <w:lang w:val="sr-Latn-RS"/>
         </w:rPr>
-        <w:t>tip upravljačkih površina (rudder+elevator / rudder+elevator+ailerons / elevons) — određuje broj servo motora</w:t>
+        <w:t>tip upravljačkih površina (</w:t>
+      </w:r>
+      <w:proofErr w:type="spellStart"/>
+      <w:r>
+        <w:rPr>
+          <w:rFonts w:ascii="Roboto" w:hAnsi="Roboto"/>
+          <w:sz w:val="22"/>
+          <w:szCs w:val="22"/>
+          <w:lang w:val="sr-Latn-RS"/>
+        </w:rPr>
+        <w:t>rudder+elevator</w:t>
+      </w:r>
+      <w:proofErr w:type="spellEnd"/>
+      <w:r>
+        <w:rPr>
+          <w:rFonts w:ascii="Roboto" w:hAnsi="Roboto"/>
+          <w:sz w:val="22"/>
+          <w:szCs w:val="22"/>
+          <w:lang w:val="sr-Latn-RS"/>
+        </w:rPr>
+        <w:t xml:space="preserve"> / </w:t>
+      </w:r>
+      <w:proofErr w:type="spellStart"/>
+      <w:r>
+        <w:rPr>
+          <w:rFonts w:ascii="Roboto" w:hAnsi="Roboto"/>
+          <w:sz w:val="22"/>
+          <w:szCs w:val="22"/>
+          <w:lang w:val="sr-Latn-RS"/>
+        </w:rPr>
+        <w:t>rudder+elevator+ailerons</w:t>
+      </w:r>
+      <w:proofErr w:type="spellEnd"/>
+      <w:r>
+        <w:rPr>
+          <w:rFonts w:ascii="Roboto" w:hAnsi="Roboto"/>
+          <w:sz w:val="22"/>
+          <w:szCs w:val="22"/>
+          <w:lang w:val="sr-Latn-RS"/>
+        </w:rPr>
+        <w:t xml:space="preserve"> / </w:t>
+      </w:r>
+      <w:proofErr w:type="spellStart"/>
+      <w:r>
+        <w:rPr>
+          <w:rFonts w:ascii="Roboto" w:hAnsi="Roboto"/>
+          <w:sz w:val="22"/>
+          <w:szCs w:val="22"/>
+          <w:lang w:val="sr-Latn-RS"/>
+        </w:rPr>
+        <w:t>elevons</w:t>
+      </w:r>
+      <w:proofErr w:type="spellEnd"/>
+      <w:r>
+        <w:rPr>
+          <w:rFonts w:ascii="Roboto" w:hAnsi="Roboto"/>
+          <w:sz w:val="22"/>
+          <w:szCs w:val="22"/>
+          <w:lang w:val="sr-Latn-RS"/>
+        </w:rPr>
+        <w:t>) — određuje broj servo motora</w:t>
       </w:r>
     </w:p>
     <w:p>
@@ -1816,14 +2345,25 @@
           <w:lang w:val="sr-Latn-RS"/>
         </w:rPr>
       </w:pPr>
-      <w:r>
-        <w:rPr>
-          <w:rFonts w:ascii="Roboto" w:hAnsi="Roboto"/>
-          <w:sz w:val="22"/>
-          <w:szCs w:val="22"/>
-          <w:lang w:val="sr-Latn-RS"/>
-        </w:rPr>
-        <w:t>webshop link</w:t>
+      <w:proofErr w:type="spellStart"/>
+      <w:r>
+        <w:rPr>
+          <w:rFonts w:ascii="Roboto" w:hAnsi="Roboto"/>
+          <w:sz w:val="22"/>
+          <w:szCs w:val="22"/>
+          <w:lang w:val="sr-Latn-RS"/>
+        </w:rPr>
+        <w:t>webshop</w:t>
+      </w:r>
+      <w:proofErr w:type="spellEnd"/>
+      <w:r>
+        <w:rPr>
+          <w:rFonts w:ascii="Roboto" w:hAnsi="Roboto"/>
+          <w:sz w:val="22"/>
+          <w:szCs w:val="22"/>
+          <w:lang w:val="sr-Latn-RS"/>
+        </w:rPr>
+        <w:t xml:space="preserve"> link</w:t>
       </w:r>
     </w:p>
     <w:p>
@@ -1838,6 +2378,7 @@
           <w:lang w:val="sr-Latn-RS"/>
         </w:rPr>
       </w:pPr>
+      <w:proofErr w:type="spellStart"/>
       <w:r>
         <w:rPr>
           <w:rFonts w:ascii="Roboto" w:hAnsi="Roboto"/>
@@ -1849,6 +2390,7 @@
         </w:rPr>
         <w:t>MotorConfiguration</w:t>
       </w:r>
+      <w:proofErr w:type="spellEnd"/>
     </w:p>
     <w:p>
       <w:pPr>
@@ -1944,14 +2486,25 @@
           <w:lang w:val="sr-Latn-RS"/>
         </w:rPr>
       </w:pPr>
-      <w:r>
-        <w:rPr>
-          <w:rFonts w:ascii="Roboto" w:hAnsi="Roboto"/>
-          <w:sz w:val="22"/>
-          <w:szCs w:val="22"/>
-          <w:lang w:val="sr-Latn-RS"/>
-        </w:rPr>
-        <w:t>thrust — potisak koji motor ostvaruje sa datim propelerom i naponom, meren u gramima</w:t>
+      <w:proofErr w:type="spellStart"/>
+      <w:r>
+        <w:rPr>
+          <w:rFonts w:ascii="Roboto" w:hAnsi="Roboto"/>
+          <w:sz w:val="22"/>
+          <w:szCs w:val="22"/>
+          <w:lang w:val="sr-Latn-RS"/>
+        </w:rPr>
+        <w:t>thrust</w:t>
+      </w:r>
+      <w:proofErr w:type="spellEnd"/>
+      <w:r>
+        <w:rPr>
+          <w:rFonts w:ascii="Roboto" w:hAnsi="Roboto"/>
+          <w:sz w:val="22"/>
+          <w:szCs w:val="22"/>
+          <w:lang w:val="sr-Latn-RS"/>
+        </w:rPr>
+        <w:t xml:space="preserve"> — potisak koji motor ostvaruje sa datim propelerom i naponom, meren u gramima</w:t>
       </w:r>
     </w:p>
     <w:p>
@@ -2015,6 +2568,7 @@
           <w:lang w:val="sr-Latn-RS"/>
         </w:rPr>
       </w:pPr>
+      <w:proofErr w:type="spellStart"/>
       <w:r>
         <w:rPr>
           <w:rFonts w:ascii="Roboto" w:hAnsi="Roboto"/>
@@ -2027,6 +2581,7 @@
         <w:lastRenderedPageBreak/>
         <w:t>Propeller</w:t>
       </w:r>
+      <w:proofErr w:type="spellEnd"/>
     </w:p>
     <w:p>
       <w:pPr>
@@ -2070,14 +2625,25 @@
           <w:lang w:val="sr-Latn-RS"/>
         </w:rPr>
       </w:pPr>
-      <w:r>
-        <w:rPr>
-          <w:rFonts w:ascii="Roboto" w:hAnsi="Roboto"/>
-          <w:sz w:val="22"/>
-          <w:szCs w:val="22"/>
-          <w:lang w:val="sr-Latn-RS"/>
-        </w:rPr>
-        <w:t>pitch — korak propelera, rastojanje koje bi propeler prešao u jednom obrtu u idealnim uslovima</w:t>
+      <w:proofErr w:type="spellStart"/>
+      <w:r>
+        <w:rPr>
+          <w:rFonts w:ascii="Roboto" w:hAnsi="Roboto"/>
+          <w:sz w:val="22"/>
+          <w:szCs w:val="22"/>
+          <w:lang w:val="sr-Latn-RS"/>
+        </w:rPr>
+        <w:t>pitch</w:t>
+      </w:r>
+      <w:proofErr w:type="spellEnd"/>
+      <w:r>
+        <w:rPr>
+          <w:rFonts w:ascii="Roboto" w:hAnsi="Roboto"/>
+          <w:sz w:val="22"/>
+          <w:szCs w:val="22"/>
+          <w:lang w:val="sr-Latn-RS"/>
+        </w:rPr>
+        <w:t xml:space="preserve"> — korak propelera, rastojanje koje bi propeler prešao u jednom obrtu u idealnim uslovima</w:t>
       </w:r>
     </w:p>
     <w:p>
@@ -2200,14 +2766,25 @@
           <w:lang w:val="sr-Latn-RS"/>
         </w:rPr>
       </w:pPr>
-      <w:r>
-        <w:rPr>
-          <w:rFonts w:ascii="Roboto" w:hAnsi="Roboto"/>
-          <w:sz w:val="22"/>
-          <w:szCs w:val="22"/>
-          <w:lang w:val="sr-Latn-RS"/>
-        </w:rPr>
-        <w:t>webshop link</w:t>
+      <w:proofErr w:type="spellStart"/>
+      <w:r>
+        <w:rPr>
+          <w:rFonts w:ascii="Roboto" w:hAnsi="Roboto"/>
+          <w:sz w:val="22"/>
+          <w:szCs w:val="22"/>
+          <w:lang w:val="sr-Latn-RS"/>
+        </w:rPr>
+        <w:t>webshop</w:t>
+      </w:r>
+      <w:proofErr w:type="spellEnd"/>
+      <w:r>
+        <w:rPr>
+          <w:rFonts w:ascii="Roboto" w:hAnsi="Roboto"/>
+          <w:sz w:val="22"/>
+          <w:szCs w:val="22"/>
+          <w:lang w:val="sr-Latn-RS"/>
+        </w:rPr>
+        <w:t xml:space="preserve"> link</w:t>
       </w:r>
     </w:p>
     <w:p>
@@ -2510,14 +3087,25 @@
           <w:lang w:val="sr-Latn-RS"/>
         </w:rPr>
       </w:pPr>
-      <w:r>
-        <w:rPr>
-          <w:rFonts w:ascii="Roboto" w:hAnsi="Roboto"/>
-          <w:sz w:val="22"/>
-          <w:szCs w:val="22"/>
-          <w:lang w:val="sr-Latn-RS"/>
-        </w:rPr>
-        <w:t>webshop link</w:t>
+      <w:proofErr w:type="spellStart"/>
+      <w:r>
+        <w:rPr>
+          <w:rFonts w:ascii="Roboto" w:hAnsi="Roboto"/>
+          <w:sz w:val="22"/>
+          <w:szCs w:val="22"/>
+          <w:lang w:val="sr-Latn-RS"/>
+        </w:rPr>
+        <w:t>webshop</w:t>
+      </w:r>
+      <w:proofErr w:type="spellEnd"/>
+      <w:r>
+        <w:rPr>
+          <w:rFonts w:ascii="Roboto" w:hAnsi="Roboto"/>
+          <w:sz w:val="22"/>
+          <w:szCs w:val="22"/>
+          <w:lang w:val="sr-Latn-RS"/>
+        </w:rPr>
+        <w:t xml:space="preserve"> link</w:t>
       </w:r>
     </w:p>
     <w:p>
@@ -2532,6 +3120,7 @@
           <w:lang w:val="sr-Latn-RS"/>
         </w:rPr>
       </w:pPr>
+      <w:proofErr w:type="spellStart"/>
       <w:r>
         <w:rPr>
           <w:rFonts w:ascii="Roboto" w:hAnsi="Roboto"/>
@@ -2543,6 +3132,7 @@
         </w:rPr>
         <w:t>Battery</w:t>
       </w:r>
+      <w:proofErr w:type="spellEnd"/>
     </w:p>
     <w:p>
       <w:pPr>
@@ -2619,7 +3209,27 @@
           <w:szCs w:val="22"/>
           <w:lang w:val="sr-Latn-RS"/>
         </w:rPr>
-        <w:t>kapacitet — kapacitet baterije meren u miliamper-satima (mAh)</w:t>
+        <w:t>kapacitet — kapacitet baterije meren u miliamper-satima (</w:t>
+      </w:r>
+      <w:proofErr w:type="spellStart"/>
+      <w:r>
+        <w:rPr>
+          <w:rFonts w:ascii="Roboto" w:hAnsi="Roboto"/>
+          <w:sz w:val="22"/>
+          <w:szCs w:val="22"/>
+          <w:lang w:val="sr-Latn-RS"/>
+        </w:rPr>
+        <w:t>mAh</w:t>
+      </w:r>
+      <w:proofErr w:type="spellEnd"/>
+      <w:r>
+        <w:rPr>
+          <w:rFonts w:ascii="Roboto" w:hAnsi="Roboto"/>
+          <w:sz w:val="22"/>
+          <w:szCs w:val="22"/>
+          <w:lang w:val="sr-Latn-RS"/>
+        </w:rPr>
+        <w:t>)</w:t>
       </w:r>
     </w:p>
     <w:p>
@@ -2645,7 +3255,85 @@
           <w:szCs w:val="22"/>
           <w:lang w:val="sr-Latn-RS"/>
         </w:rPr>
-        <w:t>C rating —određuje maksimalnu izlaznu struju (max. struja = kapacitet baterije × C rating)</w:t>
+        <w:t xml:space="preserve">C </w:t>
+      </w:r>
+      <w:proofErr w:type="spellStart"/>
+      <w:r>
+        <w:rPr>
+          <w:rFonts w:ascii="Roboto" w:hAnsi="Roboto"/>
+          <w:sz w:val="22"/>
+          <w:szCs w:val="22"/>
+          <w:lang w:val="sr-Latn-RS"/>
+        </w:rPr>
+        <w:t>rating</w:t>
+      </w:r>
+      <w:proofErr w:type="spellEnd"/>
+      <w:r>
+        <w:rPr>
+          <w:rFonts w:ascii="Roboto" w:hAnsi="Roboto"/>
+          <w:sz w:val="22"/>
+          <w:szCs w:val="22"/>
+          <w:lang w:val="sr-Latn-RS"/>
+        </w:rPr>
+        <w:t xml:space="preserve"> —</w:t>
+      </w:r>
+      <w:r>
+        <w:rPr>
+          <w:rFonts w:ascii="Roboto" w:hAnsi="Roboto"/>
+          <w:sz w:val="22"/>
+          <w:szCs w:val="22"/>
+          <w:lang w:val="sr-Latn-RS"/>
+        </w:rPr>
+        <w:t xml:space="preserve"> </w:t>
+      </w:r>
+      <w:r>
+        <w:rPr>
+          <w:rFonts w:ascii="Roboto" w:hAnsi="Roboto"/>
+          <w:sz w:val="22"/>
+          <w:szCs w:val="22"/>
+          <w:lang w:val="sr-Latn-RS"/>
+        </w:rPr>
+        <w:t>određuje maksimalnu izlaznu struju (</w:t>
+      </w:r>
+      <w:proofErr w:type="spellStart"/>
+      <w:r>
+        <w:rPr>
+          <w:rFonts w:ascii="Roboto" w:hAnsi="Roboto"/>
+          <w:sz w:val="22"/>
+          <w:szCs w:val="22"/>
+          <w:lang w:val="sr-Latn-RS"/>
+        </w:rPr>
+        <w:t>max</w:t>
+      </w:r>
+      <w:proofErr w:type="spellEnd"/>
+      <w:r>
+        <w:rPr>
+          <w:rFonts w:ascii="Roboto" w:hAnsi="Roboto"/>
+          <w:sz w:val="22"/>
+          <w:szCs w:val="22"/>
+          <w:lang w:val="sr-Latn-RS"/>
+        </w:rPr>
+        <w:t xml:space="preserve">. struja = kapacitet baterije × C </w:t>
+      </w:r>
+      <w:proofErr w:type="spellStart"/>
+      <w:r>
+        <w:rPr>
+          <w:rFonts w:ascii="Roboto" w:hAnsi="Roboto"/>
+          <w:sz w:val="22"/>
+          <w:szCs w:val="22"/>
+          <w:lang w:val="sr-Latn-RS"/>
+        </w:rPr>
+        <w:t>rating</w:t>
+      </w:r>
+      <w:proofErr w:type="spellEnd"/>
+      <w:r>
+        <w:rPr>
+          <w:rFonts w:ascii="Roboto" w:hAnsi="Roboto"/>
+          <w:sz w:val="22"/>
+          <w:szCs w:val="22"/>
+          <w:lang w:val="sr-Latn-RS"/>
+        </w:rPr>
+        <w:t>)</w:t>
       </w:r>
     </w:p>
     <w:p>
@@ -2742,14 +3430,25 @@
           <w:lang w:val="sr-Latn-RS"/>
         </w:rPr>
       </w:pPr>
-      <w:r>
-        <w:rPr>
-          <w:rFonts w:ascii="Roboto" w:hAnsi="Roboto"/>
-          <w:sz w:val="22"/>
-          <w:szCs w:val="22"/>
-          <w:lang w:val="sr-Latn-RS"/>
-        </w:rPr>
-        <w:t>webshop link</w:t>
+      <w:proofErr w:type="spellStart"/>
+      <w:r>
+        <w:rPr>
+          <w:rFonts w:ascii="Roboto" w:hAnsi="Roboto"/>
+          <w:sz w:val="22"/>
+          <w:szCs w:val="22"/>
+          <w:lang w:val="sr-Latn-RS"/>
+        </w:rPr>
+        <w:t>webshop</w:t>
+      </w:r>
+      <w:proofErr w:type="spellEnd"/>
+      <w:r>
+        <w:rPr>
+          <w:rFonts w:ascii="Roboto" w:hAnsi="Roboto"/>
+          <w:sz w:val="22"/>
+          <w:szCs w:val="22"/>
+          <w:lang w:val="sr-Latn-RS"/>
+        </w:rPr>
+        <w:t xml:space="preserve"> link</w:t>
       </w:r>
     </w:p>
     <w:p>
@@ -2816,15 +3515,37 @@
           <w:lang w:val="sr-Latn-RS"/>
         </w:rPr>
       </w:pPr>
-      <w:r>
-        <w:rPr>
-          <w:rFonts w:ascii="Roboto" w:hAnsi="Roboto"/>
-          <w:sz w:val="22"/>
-          <w:szCs w:val="22"/>
-          <w:lang w:val="sr-Latn-RS"/>
-        </w:rPr>
-        <w:t>torque — moment sile koji servo može da ostvari, meren u kg·cm</w:t>
-      </w:r>
+      <w:proofErr w:type="spellStart"/>
+      <w:r>
+        <w:rPr>
+          <w:rFonts w:ascii="Roboto" w:hAnsi="Roboto"/>
+          <w:sz w:val="22"/>
+          <w:szCs w:val="22"/>
+          <w:lang w:val="sr-Latn-RS"/>
+        </w:rPr>
+        <w:t>torque</w:t>
+      </w:r>
+      <w:proofErr w:type="spellEnd"/>
+      <w:r>
+        <w:rPr>
+          <w:rFonts w:ascii="Roboto" w:hAnsi="Roboto"/>
+          <w:sz w:val="22"/>
+          <w:szCs w:val="22"/>
+          <w:lang w:val="sr-Latn-RS"/>
+        </w:rPr>
+        <w:t xml:space="preserve"> — moment sile koji servo može da ostvari, meren u </w:t>
+      </w:r>
+      <w:proofErr w:type="spellStart"/>
+      <w:r>
+        <w:rPr>
+          <w:rFonts w:ascii="Roboto" w:hAnsi="Roboto"/>
+          <w:sz w:val="22"/>
+          <w:szCs w:val="22"/>
+          <w:lang w:val="sr-Latn-RS"/>
+        </w:rPr>
+        <w:t>kg·cm</w:t>
+      </w:r>
+      <w:proofErr w:type="spellEnd"/>
     </w:p>
     <w:p>
       <w:pPr>
@@ -2875,7 +3596,27 @@
           <w:szCs w:val="22"/>
           <w:lang w:val="sr-Latn-RS"/>
         </w:rPr>
-        <w:t>kategorija veličine — numerička ocena prikladnosti servoa za određenu veličinu modela</w:t>
+        <w:t xml:space="preserve">kategorija veličine — numerička ocena prikladnosti </w:t>
+      </w:r>
+      <w:proofErr w:type="spellStart"/>
+      <w:r>
+        <w:rPr>
+          <w:rFonts w:ascii="Roboto" w:hAnsi="Roboto"/>
+          <w:sz w:val="22"/>
+          <w:szCs w:val="22"/>
+          <w:lang w:val="sr-Latn-RS"/>
+        </w:rPr>
+        <w:t>servoa</w:t>
+      </w:r>
+      <w:proofErr w:type="spellEnd"/>
+      <w:r>
+        <w:rPr>
+          <w:rFonts w:ascii="Roboto" w:hAnsi="Roboto"/>
+          <w:sz w:val="22"/>
+          <w:szCs w:val="22"/>
+          <w:lang w:val="sr-Latn-RS"/>
+        </w:rPr>
+        <w:t xml:space="preserve"> za određenu veličinu modela</w:t>
       </w:r>
     </w:p>
     <w:p>
@@ -2953,7 +3694,27 @@
           <w:szCs w:val="22"/>
           <w:lang w:val="sr-Latn-RS"/>
         </w:rPr>
-        <w:t>struja pri zaglavljenju — maksimalna struja koju servo vuče kada je blokiran</w:t>
+        <w:t xml:space="preserve">struja pri </w:t>
+      </w:r>
+      <w:proofErr w:type="spellStart"/>
+      <w:r>
+        <w:rPr>
+          <w:rFonts w:ascii="Roboto" w:hAnsi="Roboto"/>
+          <w:sz w:val="22"/>
+          <w:szCs w:val="22"/>
+          <w:lang w:val="sr-Latn-RS"/>
+        </w:rPr>
+        <w:t>zaglavljenju</w:t>
+      </w:r>
+      <w:proofErr w:type="spellEnd"/>
+      <w:r>
+        <w:rPr>
+          <w:rFonts w:ascii="Roboto" w:hAnsi="Roboto"/>
+          <w:sz w:val="22"/>
+          <w:szCs w:val="22"/>
+          <w:lang w:val="sr-Latn-RS"/>
+        </w:rPr>
+        <w:t xml:space="preserve"> — maksimalna struja koju servo vuče kada je blokiran</w:t>
       </w:r>
     </w:p>
     <w:p>
@@ -3050,14 +3811,25 @@
           <w:lang w:val="sr-Latn-RS"/>
         </w:rPr>
       </w:pPr>
-      <w:r>
-        <w:rPr>
-          <w:rFonts w:ascii="Roboto" w:hAnsi="Roboto"/>
-          <w:sz w:val="22"/>
-          <w:szCs w:val="22"/>
-          <w:lang w:val="sr-Latn-RS"/>
-        </w:rPr>
-        <w:t>webshop link</w:t>
+      <w:proofErr w:type="spellStart"/>
+      <w:r>
+        <w:rPr>
+          <w:rFonts w:ascii="Roboto" w:hAnsi="Roboto"/>
+          <w:sz w:val="22"/>
+          <w:szCs w:val="22"/>
+          <w:lang w:val="sr-Latn-RS"/>
+        </w:rPr>
+        <w:t>webshop</w:t>
+      </w:r>
+      <w:proofErr w:type="spellEnd"/>
+      <w:r>
+        <w:rPr>
+          <w:rFonts w:ascii="Roboto" w:hAnsi="Roboto"/>
+          <w:sz w:val="22"/>
+          <w:szCs w:val="22"/>
+          <w:lang w:val="sr-Latn-RS"/>
+        </w:rPr>
+        <w:t xml:space="preserve"> link</w:t>
       </w:r>
     </w:p>
     <w:p>
@@ -3072,6 +3844,7 @@
           <w:lang w:val="sr-Latn-RS"/>
         </w:rPr>
       </w:pPr>
+      <w:proofErr w:type="spellStart"/>
       <w:r>
         <w:rPr>
           <w:rFonts w:ascii="Roboto" w:hAnsi="Roboto"/>
@@ -3083,6 +3856,7 @@
         </w:rPr>
         <w:t>Receiver</w:t>
       </w:r>
+      <w:proofErr w:type="spellEnd"/>
     </w:p>
     <w:p>
       <w:pPr>
@@ -3165,761 +3939,10 @@
           <w:lang w:val="sr-Latn-RS"/>
         </w:rPr>
         <w:lastRenderedPageBreak/>
-        <w:t>3.3.2 Forward chaining</w:t>
-      </w:r>
-    </w:p>
-    <w:p>
-      <w:pPr>
-        <w:pStyle w:val="FirstParagraph"/>
-        <w:jc w:val="both"/>
-        <w:rPr>
-          <w:rFonts w:ascii="Roboto" w:hAnsi="Roboto"/>
-          <w:sz w:val="22"/>
-          <w:szCs w:val="22"/>
-          <w:lang w:val="sr-Latn-RS"/>
-        </w:rPr>
-      </w:pPr>
-      <w:r>
-        <w:rPr>
-          <w:rFonts w:ascii="Roboto" w:hAnsi="Roboto"/>
-          <w:sz w:val="22"/>
-          <w:szCs w:val="22"/>
-          <w:lang w:val="sr-Latn-RS"/>
-        </w:rPr>
-        <w:t>Forward chaining se primenjuje nakon što je kombinacija komponenti poznata. Na osnovu odabranih komponenti sistem određuje da li su one međusobno kompatibilne, da li je kombinacija zadovoljavajuća za odabrani model, kao i da li u narednim danima postoji prikladan termin za letenje.</w:t>
-      </w:r>
-      <w:r>
-        <w:rPr>
-          <w:rFonts w:ascii="Roboto" w:hAnsi="Roboto"/>
-          <w:sz w:val="22"/>
-          <w:szCs w:val="22"/>
-          <w:lang w:val="sr-Latn-RS"/>
-        </w:rPr>
-        <w:t xml:space="preserve"> </w:t>
-      </w:r>
-      <w:r>
-        <w:rPr>
-          <w:rFonts w:ascii="Roboto" w:hAnsi="Roboto"/>
-          <w:sz w:val="22"/>
-          <w:szCs w:val="22"/>
-          <w:lang w:val="sr-Latn-RS"/>
-        </w:rPr>
-        <w:t>Pravila su organizovana u tri nivoa:</w:t>
-      </w:r>
-    </w:p>
-    <w:p>
-      <w:pPr>
-        <w:pStyle w:val="BodyText"/>
-        <w:spacing w:after="80"/>
-        <w:jc w:val="both"/>
-        <w:rPr>
-          <w:rFonts w:ascii="Roboto" w:hAnsi="Roboto"/>
-          <w:sz w:val="22"/>
-          <w:szCs w:val="22"/>
-          <w:lang w:val="sr-Latn-RS"/>
-        </w:rPr>
-      </w:pPr>
-      <w:r>
-        <w:rPr>
-          <w:rFonts w:ascii="Roboto" w:hAnsi="Roboto"/>
-          <w:b/>
-          <w:bCs/>
-          <w:sz w:val="22"/>
-          <w:szCs w:val="22"/>
-          <w:lang w:val="sr-Latn-RS"/>
-        </w:rPr>
-        <w:t>Nivo 1</w:t>
-      </w:r>
-      <w:r>
-        <w:rPr>
-          <w:rFonts w:ascii="Roboto" w:hAnsi="Roboto"/>
-          <w:sz w:val="22"/>
-          <w:szCs w:val="22"/>
-          <w:lang w:val="sr-Latn-RS"/>
-        </w:rPr>
-        <w:t xml:space="preserve"> — korekcija težine, računanje ukupne mase i potrošnje modela</w:t>
-      </w:r>
-    </w:p>
-    <w:p>
-      <w:pPr>
-        <w:pStyle w:val="Compact"/>
-        <w:numPr>
-          <w:ilvl w:val="0"/>
-          <w:numId w:val="12"/>
-        </w:numPr>
-        <w:ind w:left="426" w:hanging="284"/>
-        <w:jc w:val="both"/>
-        <w:rPr>
-          <w:rFonts w:ascii="Roboto" w:hAnsi="Roboto"/>
-          <w:sz w:val="22"/>
-          <w:szCs w:val="22"/>
-          <w:lang w:val="sr-Latn-RS"/>
-        </w:rPr>
-      </w:pPr>
-      <w:r>
-        <w:rPr>
-          <w:rFonts w:ascii="Roboto" w:hAnsi="Roboto"/>
-          <w:sz w:val="22"/>
-          <w:szCs w:val="22"/>
-          <w:lang w:val="sr-Latn-RS"/>
-        </w:rPr>
-        <w:t>Ako je težina korisnikove karton pene različita od referentne (2.927 g/dm²), onda se dry weight modela koriguje u odnosu na datu težinu</w:t>
-      </w:r>
-    </w:p>
-    <w:p>
-      <w:pPr>
-        <w:pStyle w:val="Compact"/>
-        <w:numPr>
-          <w:ilvl w:val="0"/>
-          <w:numId w:val="12"/>
-        </w:numPr>
-        <w:ind w:left="426" w:hanging="284"/>
-        <w:jc w:val="both"/>
-        <w:rPr>
-          <w:rFonts w:ascii="Roboto" w:hAnsi="Roboto"/>
-          <w:sz w:val="22"/>
-          <w:szCs w:val="22"/>
-          <w:lang w:val="sr-Latn-RS"/>
-        </w:rPr>
-      </w:pPr>
-      <w:r>
-        <w:rPr>
-          <w:rFonts w:ascii="Roboto" w:hAnsi="Roboto"/>
-          <w:sz w:val="22"/>
-          <w:szCs w:val="22"/>
-          <w:lang w:val="sr-Latn-RS"/>
-        </w:rPr>
-        <w:t>Ako je faktor skaliranja različit od 1, model se koriguje tako što se dry weight modela množi sa kvadratom faktora skaliranja</w:t>
-      </w:r>
-    </w:p>
-    <w:p>
-      <w:pPr>
-        <w:pStyle w:val="Compact"/>
-        <w:numPr>
-          <w:ilvl w:val="0"/>
-          <w:numId w:val="12"/>
-        </w:numPr>
-        <w:ind w:left="426" w:hanging="284"/>
-        <w:jc w:val="both"/>
-        <w:rPr>
-          <w:rFonts w:ascii="Roboto" w:hAnsi="Roboto"/>
-          <w:sz w:val="22"/>
-          <w:szCs w:val="22"/>
-          <w:lang w:val="sr-Latn-RS"/>
-        </w:rPr>
-      </w:pPr>
-      <w:r>
-        <w:rPr>
-          <w:rFonts w:ascii="Roboto" w:hAnsi="Roboto"/>
-          <w:sz w:val="22"/>
-          <w:szCs w:val="22"/>
-          <w:lang w:val="sr-Latn-RS"/>
-        </w:rPr>
-        <w:t xml:space="preserve">Ako je korigovana težina airframe-a izračunata, onda se uz pomoć </w:t>
-      </w:r>
-      <w:r>
-        <w:rPr>
-          <w:rStyle w:val="VerbatimChar"/>
-          <w:rFonts w:ascii="Roboto" w:hAnsi="Roboto"/>
-          <w:sz w:val="20"/>
-          <w:szCs w:val="22"/>
-          <w:lang w:val="sr-Latn-RS"/>
-        </w:rPr>
-        <w:t>accumulate</w:t>
-      </w:r>
-      <w:r>
-        <w:rPr>
-          <w:rFonts w:ascii="Roboto" w:hAnsi="Roboto"/>
-          <w:sz w:val="22"/>
-          <w:szCs w:val="22"/>
-          <w:lang w:val="sr-Latn-RS"/>
-        </w:rPr>
-        <w:t xml:space="preserve"> funkcije sabira sa težinama svih odabranih komponenti i dobija ukupna težina modela</w:t>
-      </w:r>
-    </w:p>
-    <w:p>
-      <w:pPr>
-        <w:pStyle w:val="Compact"/>
-        <w:numPr>
-          <w:ilvl w:val="0"/>
-          <w:numId w:val="12"/>
-        </w:numPr>
-        <w:ind w:left="426" w:hanging="284"/>
-        <w:jc w:val="both"/>
-        <w:rPr>
-          <w:rFonts w:ascii="Roboto" w:hAnsi="Roboto"/>
-          <w:sz w:val="22"/>
-          <w:szCs w:val="22"/>
-          <w:lang w:val="sr-Latn-RS"/>
-        </w:rPr>
-      </w:pPr>
-      <w:r>
-        <w:rPr>
-          <w:rFonts w:ascii="Roboto" w:hAnsi="Roboto"/>
-          <w:sz w:val="22"/>
-          <w:szCs w:val="22"/>
-          <w:lang w:val="sr-Latn-RS"/>
-        </w:rPr>
-        <w:t xml:space="preserve">Ako su sve komponente odabrane, onda se </w:t>
-      </w:r>
-      <w:r>
-        <w:rPr>
-          <w:rStyle w:val="VerbatimChar"/>
-          <w:rFonts w:ascii="Roboto" w:hAnsi="Roboto"/>
-          <w:sz w:val="20"/>
-          <w:szCs w:val="22"/>
-          <w:lang w:val="sr-Latn-RS"/>
-        </w:rPr>
-        <w:t>accumulate</w:t>
-      </w:r>
-      <w:r>
-        <w:rPr>
-          <w:rFonts w:ascii="Roboto" w:hAnsi="Roboto"/>
-          <w:sz w:val="22"/>
-          <w:szCs w:val="22"/>
-          <w:lang w:val="sr-Latn-RS"/>
-        </w:rPr>
-        <w:t xml:space="preserve"> funkcijom sabira maksimalna potrošnja svih komponenti (motor, servoi, prijemnik) i dobija ukupna maksimalna potrošnja modela</w:t>
-      </w:r>
-    </w:p>
-    <w:p>
-      <w:pPr>
-        <w:pStyle w:val="FirstParagraph"/>
-        <w:spacing w:after="80"/>
-        <w:jc w:val="both"/>
-        <w:rPr>
-          <w:rFonts w:ascii="Roboto" w:hAnsi="Roboto"/>
-          <w:sz w:val="22"/>
-          <w:szCs w:val="22"/>
-          <w:lang w:val="sr-Latn-RS"/>
-        </w:rPr>
-      </w:pPr>
-      <w:r>
-        <w:rPr>
-          <w:rFonts w:ascii="Roboto" w:hAnsi="Roboto"/>
-          <w:b/>
-          <w:bCs/>
-          <w:sz w:val="22"/>
-          <w:szCs w:val="22"/>
-          <w:lang w:val="sr-Latn-RS"/>
-        </w:rPr>
-        <w:t>Nivo 2</w:t>
-      </w:r>
-      <w:r>
-        <w:rPr>
-          <w:rFonts w:ascii="Roboto" w:hAnsi="Roboto"/>
-          <w:sz w:val="22"/>
-          <w:szCs w:val="22"/>
-          <w:lang w:val="sr-Latn-RS"/>
-        </w:rPr>
-        <w:t xml:space="preserve"> — provera ispravnosti kombinacije komponenti</w:t>
-      </w:r>
-    </w:p>
-    <w:p>
-      <w:pPr>
-        <w:pStyle w:val="Compact"/>
-        <w:numPr>
-          <w:ilvl w:val="0"/>
-          <w:numId w:val="13"/>
-        </w:numPr>
-        <w:ind w:left="426" w:hanging="284"/>
-        <w:jc w:val="both"/>
-        <w:rPr>
-          <w:rFonts w:ascii="Roboto" w:hAnsi="Roboto"/>
-          <w:sz w:val="22"/>
-          <w:szCs w:val="22"/>
-          <w:lang w:val="sr-Latn-RS"/>
-        </w:rPr>
-      </w:pPr>
-      <w:r>
-        <w:rPr>
-          <w:rFonts w:ascii="Roboto" w:hAnsi="Roboto"/>
-          <w:sz w:val="22"/>
-          <w:szCs w:val="22"/>
-          <w:lang w:val="sr-Latn-RS"/>
-        </w:rPr>
-        <w:t>Ako je ukupna težina modela poznata, onda se računa odnos težine i potiska odabrane motor konfiguracije (T/W faktor)</w:t>
-      </w:r>
-    </w:p>
-    <w:p>
-      <w:pPr>
-        <w:pStyle w:val="Compact"/>
-        <w:numPr>
-          <w:ilvl w:val="0"/>
-          <w:numId w:val="13"/>
-        </w:numPr>
-        <w:ind w:left="426" w:hanging="284"/>
-        <w:jc w:val="both"/>
-        <w:rPr>
-          <w:rFonts w:ascii="Roboto" w:hAnsi="Roboto"/>
-          <w:sz w:val="22"/>
-          <w:szCs w:val="22"/>
-          <w:lang w:val="sr-Latn-RS"/>
-        </w:rPr>
-      </w:pPr>
-      <w:r>
-        <w:rPr>
-          <w:rFonts w:ascii="Roboto" w:hAnsi="Roboto"/>
-          <w:sz w:val="22"/>
-          <w:szCs w:val="22"/>
-          <w:lang w:val="sr-Latn-RS"/>
-        </w:rPr>
-        <w:t>Ako je ukupna težina modela poznata, onda se računa WCL faktor kao količnik ukupne težine modela i površine krila prilagođene faktoru skaliranja stepenovan sa 1.5</w:t>
-      </w:r>
-    </w:p>
-    <w:p>
-      <w:pPr>
-        <w:pStyle w:val="Compact"/>
-        <w:numPr>
-          <w:ilvl w:val="0"/>
-          <w:numId w:val="13"/>
-        </w:numPr>
-        <w:ind w:left="426" w:hanging="284"/>
-        <w:jc w:val="both"/>
-        <w:rPr>
-          <w:rFonts w:ascii="Roboto" w:hAnsi="Roboto"/>
-          <w:sz w:val="22"/>
-          <w:szCs w:val="22"/>
-          <w:lang w:val="sr-Latn-RS"/>
-        </w:rPr>
-      </w:pPr>
-      <w:r>
-        <w:rPr>
-          <w:rFonts w:ascii="Roboto" w:hAnsi="Roboto"/>
-          <w:sz w:val="22"/>
-          <w:szCs w:val="22"/>
-          <w:lang w:val="sr-Latn-RS"/>
-        </w:rPr>
-        <w:t>Ako je ukupna maksimalna potrošnja modela poznata, onda se računa procenjeno minimalno vreme letenja kao količnik kapaciteta baterije i ukupne maksimalne potrošnje</w:t>
-      </w:r>
-    </w:p>
-    <w:p>
-      <w:pPr>
-        <w:pStyle w:val="Compact"/>
-        <w:numPr>
-          <w:ilvl w:val="0"/>
-          <w:numId w:val="13"/>
-        </w:numPr>
-        <w:ind w:left="426" w:hanging="284"/>
-        <w:jc w:val="both"/>
-        <w:rPr>
-          <w:rFonts w:ascii="Roboto" w:hAnsi="Roboto"/>
-          <w:sz w:val="22"/>
-          <w:szCs w:val="22"/>
-          <w:lang w:val="sr-Latn-RS"/>
-        </w:rPr>
-      </w:pPr>
-      <w:r>
-        <w:rPr>
-          <w:rFonts w:ascii="Roboto" w:hAnsi="Roboto"/>
-          <w:sz w:val="22"/>
-          <w:szCs w:val="22"/>
-          <w:lang w:val="sr-Latn-RS"/>
-        </w:rPr>
-        <w:t>Ako je maksimalna izlazna struja baterije (kapacitet × C rating) manja od ukupne maksimalne potrošnje, onda se generiše upozorenje o nekompatibilnoj bateriji</w:t>
-      </w:r>
-    </w:p>
-    <w:p>
-      <w:pPr>
-        <w:pStyle w:val="Compact"/>
-        <w:numPr>
-          <w:ilvl w:val="0"/>
-          <w:numId w:val="13"/>
-        </w:numPr>
-        <w:ind w:left="426" w:hanging="284"/>
-        <w:jc w:val="both"/>
-        <w:rPr>
-          <w:rFonts w:ascii="Roboto" w:hAnsi="Roboto"/>
-          <w:sz w:val="22"/>
-          <w:szCs w:val="22"/>
-          <w:lang w:val="sr-Latn-RS"/>
-        </w:rPr>
-      </w:pPr>
-      <w:r>
-        <w:rPr>
-          <w:rFonts w:ascii="Roboto" w:hAnsi="Roboto"/>
-          <w:sz w:val="22"/>
-          <w:szCs w:val="22"/>
-          <w:lang w:val="sr-Latn-RS"/>
-        </w:rPr>
-        <w:t>Ako je maksimalna struja ESC-a manja od maksimalne struje motora, onda se generiše upozorenje o nekompatibilnom ESC-u</w:t>
-      </w:r>
-    </w:p>
-    <w:p>
-      <w:pPr>
-        <w:pStyle w:val="Compact"/>
-        <w:numPr>
-          <w:ilvl w:val="0"/>
-          <w:numId w:val="13"/>
-        </w:numPr>
-        <w:ind w:left="426" w:hanging="284"/>
-        <w:jc w:val="both"/>
-        <w:rPr>
-          <w:rFonts w:ascii="Roboto" w:hAnsi="Roboto"/>
-          <w:sz w:val="22"/>
-          <w:szCs w:val="22"/>
-          <w:lang w:val="sr-Latn-RS"/>
-        </w:rPr>
-      </w:pPr>
-      <w:r>
-        <w:rPr>
-          <w:rFonts w:ascii="Roboto" w:hAnsi="Roboto"/>
-          <w:sz w:val="22"/>
-          <w:szCs w:val="22"/>
-          <w:lang w:val="sr-Latn-RS"/>
-        </w:rPr>
-        <w:t>Ako je BEC maksimalna struja manja od ukupne potrošnje servoa i prijemnika, onda se generiše upozorenje o nekompatibilnom BEC-u</w:t>
-      </w:r>
-    </w:p>
-    <w:p>
-      <w:pPr>
-        <w:pStyle w:val="Compact"/>
-        <w:numPr>
-          <w:ilvl w:val="0"/>
-          <w:numId w:val="13"/>
-        </w:numPr>
-        <w:ind w:left="426" w:hanging="284"/>
-        <w:jc w:val="both"/>
-        <w:rPr>
-          <w:rFonts w:ascii="Roboto" w:hAnsi="Roboto"/>
-          <w:sz w:val="22"/>
-          <w:szCs w:val="22"/>
-          <w:lang w:val="sr-Latn-RS"/>
-        </w:rPr>
-      </w:pPr>
-      <w:r>
-        <w:rPr>
-          <w:rFonts w:ascii="Roboto" w:hAnsi="Roboto"/>
-          <w:sz w:val="22"/>
-          <w:szCs w:val="22"/>
-          <w:lang w:val="sr-Latn-RS"/>
-        </w:rPr>
-        <w:t>Ako je zadato minimalno vreme letenja i procenjeno vreme letenja je manje od njega, onda se generiše upozorenje o premalom kapacitetu baterije</w:t>
-      </w:r>
-    </w:p>
-    <w:p>
-      <w:pPr>
-        <w:pStyle w:val="FirstParagraph"/>
-        <w:spacing w:after="80"/>
-        <w:jc w:val="both"/>
-        <w:rPr>
-          <w:rFonts w:ascii="Roboto" w:hAnsi="Roboto"/>
-          <w:sz w:val="22"/>
-          <w:szCs w:val="22"/>
-          <w:lang w:val="sr-Latn-RS"/>
-        </w:rPr>
-      </w:pPr>
-      <w:r>
-        <w:rPr>
-          <w:rFonts w:ascii="Roboto" w:hAnsi="Roboto"/>
-          <w:b/>
-          <w:bCs/>
-          <w:sz w:val="22"/>
-          <w:szCs w:val="22"/>
-          <w:lang w:val="sr-Latn-RS"/>
-        </w:rPr>
-        <w:t>Nivo 3</w:t>
-      </w:r>
-      <w:r>
-        <w:rPr>
-          <w:rFonts w:ascii="Roboto" w:hAnsi="Roboto"/>
-          <w:sz w:val="22"/>
-          <w:szCs w:val="22"/>
-          <w:lang w:val="sr-Latn-RS"/>
-        </w:rPr>
-        <w:t xml:space="preserve"> — klasifikacija modela i preporuka termina letenja</w:t>
-      </w:r>
-    </w:p>
-    <w:p>
-      <w:pPr>
-        <w:pStyle w:val="Compact"/>
-        <w:numPr>
-          <w:ilvl w:val="0"/>
-          <w:numId w:val="14"/>
-        </w:numPr>
-        <w:ind w:left="426" w:hanging="284"/>
-        <w:jc w:val="both"/>
-        <w:rPr>
-          <w:rFonts w:ascii="Roboto" w:hAnsi="Roboto"/>
-          <w:sz w:val="22"/>
-          <w:szCs w:val="22"/>
-          <w:lang w:val="sr-Latn-RS"/>
-        </w:rPr>
-      </w:pPr>
-      <w:r>
-        <w:rPr>
-          <w:rFonts w:ascii="Roboto" w:hAnsi="Roboto"/>
-          <w:sz w:val="22"/>
-          <w:szCs w:val="22"/>
-          <w:lang w:val="sr-Latn-RS"/>
-        </w:rPr>
-        <w:t>Ako je T/W faktor manji od minimalnog zadatog, onda se generiše upozorenje o nedovoljnom potisku (loš izbor motora, propelera ili baterije)</w:t>
-      </w:r>
-    </w:p>
-    <w:p>
-      <w:pPr>
-        <w:pStyle w:val="Compact"/>
-        <w:numPr>
-          <w:ilvl w:val="0"/>
-          <w:numId w:val="14"/>
-        </w:numPr>
-        <w:ind w:left="426" w:hanging="284"/>
-        <w:jc w:val="both"/>
-        <w:rPr>
-          <w:rFonts w:ascii="Roboto" w:hAnsi="Roboto"/>
-          <w:sz w:val="22"/>
-          <w:szCs w:val="22"/>
-          <w:lang w:val="sr-Latn-RS"/>
-        </w:rPr>
-      </w:pPr>
-      <w:r>
-        <w:rPr>
-          <w:rFonts w:ascii="Roboto" w:hAnsi="Roboto"/>
-          <w:sz w:val="22"/>
-          <w:szCs w:val="22"/>
-          <w:lang w:val="sr-Latn-RS"/>
-        </w:rPr>
-        <w:t>Ako su T/W i WCL faktori izračunati i T/W zadovoljava minimum, onda se na osnovu WCL faktora i odnosa izračunatog i preporučenog T/W faktora određuje klasa manevrabilnosti modela</w:t>
-      </w:r>
-    </w:p>
-    <w:p>
-      <w:pPr>
-        <w:pStyle w:val="Compact"/>
-        <w:numPr>
-          <w:ilvl w:val="0"/>
-          <w:numId w:val="14"/>
-        </w:numPr>
-        <w:ind w:left="426" w:hanging="284"/>
-        <w:jc w:val="both"/>
-        <w:rPr>
-          <w:rFonts w:ascii="Roboto" w:hAnsi="Roboto"/>
-          <w:sz w:val="22"/>
-          <w:szCs w:val="22"/>
-          <w:lang w:val="sr-Latn-RS"/>
-        </w:rPr>
-      </w:pPr>
-      <w:r>
-        <w:rPr>
-          <w:rFonts w:ascii="Roboto" w:hAnsi="Roboto"/>
-          <w:sz w:val="22"/>
-          <w:szCs w:val="22"/>
-          <w:lang w:val="sr-Latn-RS"/>
-        </w:rPr>
-        <w:t>Ako je klasa manevrabilnosti određena, onda se na osnovu nje i ukupne težine modela određuju pragovi prihvatljivosti brzine vetra — donji prag ispod kojeg je vetar idealan i gornji prag iznad kojeg je vetar neprihvatljiv</w:t>
-      </w:r>
-    </w:p>
-    <w:p>
-      <w:pPr>
-        <w:pStyle w:val="Compact"/>
-        <w:numPr>
-          <w:ilvl w:val="0"/>
-          <w:numId w:val="14"/>
-        </w:numPr>
-        <w:ind w:left="426" w:hanging="284"/>
-        <w:jc w:val="both"/>
-        <w:rPr>
-          <w:rFonts w:ascii="Roboto" w:hAnsi="Roboto"/>
-          <w:sz w:val="22"/>
-          <w:szCs w:val="22"/>
-          <w:lang w:val="sr-Latn-RS"/>
-        </w:rPr>
-      </w:pPr>
-      <w:r>
-        <w:rPr>
-          <w:rFonts w:ascii="Roboto" w:hAnsi="Roboto"/>
-          <w:sz w:val="22"/>
-          <w:szCs w:val="22"/>
-          <w:lang w:val="sr-Latn-RS"/>
-        </w:rPr>
-        <w:t>Ako pada kiša, onda se termin označava kao neprikladan</w:t>
-      </w:r>
-    </w:p>
-    <w:p>
-      <w:pPr>
-        <w:pStyle w:val="Compact"/>
-        <w:numPr>
-          <w:ilvl w:val="0"/>
-          <w:numId w:val="14"/>
-        </w:numPr>
-        <w:ind w:left="426" w:hanging="284"/>
-        <w:jc w:val="both"/>
-        <w:rPr>
-          <w:rFonts w:ascii="Roboto" w:hAnsi="Roboto"/>
-          <w:sz w:val="22"/>
-          <w:szCs w:val="22"/>
-          <w:lang w:val="sr-Latn-RS"/>
-        </w:rPr>
-      </w:pPr>
-      <w:r>
-        <w:rPr>
-          <w:rFonts w:ascii="Roboto" w:hAnsi="Roboto"/>
-          <w:sz w:val="22"/>
-          <w:szCs w:val="22"/>
-          <w:lang w:val="sr-Latn-RS"/>
-        </w:rPr>
-        <w:t>Ako je noć, onda se termin označava kao neprikladan</w:t>
-      </w:r>
-    </w:p>
-    <w:p>
-      <w:pPr>
-        <w:pStyle w:val="Compact"/>
-        <w:numPr>
-          <w:ilvl w:val="0"/>
-          <w:numId w:val="14"/>
-        </w:numPr>
-        <w:ind w:left="426" w:hanging="284"/>
-        <w:jc w:val="both"/>
-        <w:rPr>
-          <w:rFonts w:ascii="Roboto" w:hAnsi="Roboto"/>
-          <w:sz w:val="22"/>
-          <w:szCs w:val="22"/>
-          <w:lang w:val="sr-Latn-RS"/>
-        </w:rPr>
-      </w:pPr>
-      <w:r>
-        <w:rPr>
-          <w:rFonts w:ascii="Roboto" w:hAnsi="Roboto"/>
-          <w:sz w:val="22"/>
-          <w:szCs w:val="22"/>
-          <w:lang w:val="sr-Latn-RS"/>
-        </w:rPr>
-        <w:t>Ako je vetar iznad gornjeg praga, onda se termin označava kao neprikladan</w:t>
-      </w:r>
-    </w:p>
-    <w:p>
-      <w:pPr>
-        <w:pStyle w:val="Compact"/>
-        <w:numPr>
-          <w:ilvl w:val="0"/>
-          <w:numId w:val="14"/>
-        </w:numPr>
-        <w:ind w:left="426" w:hanging="284"/>
-        <w:jc w:val="both"/>
-        <w:rPr>
-          <w:rFonts w:ascii="Roboto" w:hAnsi="Roboto"/>
-          <w:sz w:val="22"/>
-          <w:szCs w:val="22"/>
-          <w:lang w:val="sr-Latn-RS"/>
-        </w:rPr>
-      </w:pPr>
-      <w:r>
-        <w:rPr>
-          <w:rFonts w:ascii="Roboto" w:hAnsi="Roboto"/>
-          <w:sz w:val="22"/>
-          <w:szCs w:val="22"/>
-          <w:lang w:val="sr-Latn-RS"/>
-        </w:rPr>
-        <w:t>Ako termin nije neprikladan i nedavno je padala kiša, onda se termin označava kao prihvatljiv</w:t>
-      </w:r>
-    </w:p>
-    <w:p>
-      <w:pPr>
-        <w:pStyle w:val="Compact"/>
-        <w:numPr>
-          <w:ilvl w:val="0"/>
-          <w:numId w:val="14"/>
-        </w:numPr>
-        <w:ind w:left="426" w:hanging="284"/>
-        <w:jc w:val="both"/>
-        <w:rPr>
-          <w:rFonts w:ascii="Roboto" w:hAnsi="Roboto"/>
-          <w:sz w:val="22"/>
-          <w:szCs w:val="22"/>
-          <w:lang w:val="sr-Latn-RS"/>
-        </w:rPr>
-      </w:pPr>
-      <w:r>
-        <w:rPr>
-          <w:rFonts w:ascii="Roboto" w:hAnsi="Roboto"/>
-          <w:sz w:val="22"/>
-          <w:szCs w:val="22"/>
-          <w:lang w:val="sr-Latn-RS"/>
-        </w:rPr>
-        <w:t>Ako termin nije neprikladan i vetar je između donjeg i gornjeg praga, onda se termin označava kao prihvatljiv</w:t>
-      </w:r>
-    </w:p>
-    <w:p>
-      <w:pPr>
-        <w:pStyle w:val="Compact"/>
-        <w:numPr>
-          <w:ilvl w:val="0"/>
-          <w:numId w:val="14"/>
-        </w:numPr>
-        <w:ind w:left="426" w:hanging="284"/>
-        <w:jc w:val="both"/>
-        <w:rPr>
-          <w:rFonts w:ascii="Roboto" w:hAnsi="Roboto"/>
-          <w:sz w:val="22"/>
-          <w:szCs w:val="22"/>
-          <w:lang w:val="sr-Latn-RS"/>
-        </w:rPr>
-      </w:pPr>
-      <w:r>
-        <w:rPr>
-          <w:rFonts w:ascii="Roboto" w:hAnsi="Roboto"/>
-          <w:sz w:val="22"/>
-          <w:szCs w:val="22"/>
-          <w:lang w:val="sr-Latn-RS"/>
-        </w:rPr>
-        <w:t>Ako termin nije neprikladan i temperatura je između prihvatljive i idealne granice, onda se termin označava kao prihvatljiv</w:t>
-      </w:r>
-    </w:p>
-    <w:p>
-      <w:pPr>
-        <w:pStyle w:val="Compact"/>
-        <w:numPr>
-          <w:ilvl w:val="0"/>
-          <w:numId w:val="14"/>
-        </w:numPr>
-        <w:ind w:left="426" w:hanging="284"/>
-        <w:jc w:val="both"/>
-        <w:rPr>
-          <w:rFonts w:ascii="Roboto" w:hAnsi="Roboto"/>
-          <w:sz w:val="22"/>
-          <w:szCs w:val="22"/>
-          <w:lang w:val="sr-Latn-RS"/>
-        </w:rPr>
-      </w:pPr>
-      <w:r>
-        <w:rPr>
-          <w:rFonts w:ascii="Roboto" w:hAnsi="Roboto"/>
-          <w:sz w:val="22"/>
-          <w:szCs w:val="22"/>
-          <w:lang w:val="sr-Latn-RS"/>
-        </w:rPr>
-        <w:t>Ako termin nije neprikladan i termin je blizu zalaska sunca, onda se termin označava kao prihvatljiv</w:t>
-      </w:r>
-    </w:p>
-    <w:p>
-      <w:pPr>
-        <w:pStyle w:val="Compact"/>
-        <w:numPr>
-          <w:ilvl w:val="0"/>
-          <w:numId w:val="14"/>
-        </w:numPr>
-        <w:ind w:left="426" w:hanging="284"/>
-        <w:jc w:val="both"/>
-        <w:rPr>
-          <w:rFonts w:ascii="Roboto" w:hAnsi="Roboto"/>
-          <w:sz w:val="22"/>
-          <w:szCs w:val="22"/>
-          <w:lang w:val="sr-Latn-RS"/>
-        </w:rPr>
-      </w:pPr>
-      <w:r>
-        <w:rPr>
-          <w:rFonts w:ascii="Roboto" w:hAnsi="Roboto"/>
-          <w:sz w:val="22"/>
-          <w:szCs w:val="22"/>
-          <w:lang w:val="sr-Latn-RS"/>
-        </w:rPr>
-        <w:t>Ako termin nije neprikladan, nema nedavnih padavina, vetar je ispod donjeg praga, temperatura je u idealnom opsegu i ima dovoljno dnevnog svetla, onda se termin označava kao idealan</w:t>
-      </w:r>
-    </w:p>
-    <w:p>
-      <w:pPr>
-        <w:pStyle w:val="Heading4"/>
-        <w:jc w:val="both"/>
+        <w:t xml:space="preserve">3.3.2 </w:t>
+      </w:r>
+      <w:proofErr w:type="spellStart"/>
+      <w:r>
         <w:rPr>
           <w:rFonts w:ascii="Roboto" w:hAnsi="Roboto"/>
           <w:b/>
@@ -3930,9 +3953,9 @@
           <w:szCs w:val="22"/>
           <w:lang w:val="sr-Latn-RS"/>
         </w:rPr>
-      </w:pPr>
-      <w:bookmarkStart w:id="10" w:name="backward-chaining"/>
-      <w:bookmarkEnd w:id="9"/>
+        <w:t>Forward</w:t>
+      </w:r>
+      <w:proofErr w:type="spellEnd"/>
       <w:r>
         <w:rPr>
           <w:rFonts w:ascii="Roboto" w:hAnsi="Roboto"/>
@@ -3944,187 +3967,10 @@
           <w:szCs w:val="22"/>
           <w:lang w:val="sr-Latn-RS"/>
         </w:rPr>
-        <w:lastRenderedPageBreak/>
-        <w:t>3.3.3 Backward chaining</w:t>
-      </w:r>
-    </w:p>
-    <w:p>
-      <w:pPr>
-        <w:pStyle w:val="FirstParagraph"/>
-        <w:jc w:val="both"/>
-        <w:rPr>
-          <w:rFonts w:ascii="Roboto" w:hAnsi="Roboto"/>
-          <w:sz w:val="22"/>
-          <w:szCs w:val="22"/>
-          <w:lang w:val="sr-Latn-RS"/>
-        </w:rPr>
-      </w:pPr>
-      <w:r>
-        <w:rPr>
-          <w:rFonts w:ascii="Roboto" w:hAnsi="Roboto"/>
-          <w:sz w:val="22"/>
-          <w:szCs w:val="22"/>
-          <w:lang w:val="sr-Latn-RS"/>
-        </w:rPr>
-        <w:t>Kada korisnik zatraži automatski predlog kombinacije komponenti, sistem unazad dokazuje da za odabrani model postoji ispravna kombinacija komponenti. Komponente koje su nedostupne sistem ne uzima u obzir pri pretrazi, ali korisnik ih može ručno odabrati. Korisnik može zaključati određene komponente, u tom slučaju sistem te komponente ne bira automatski već njima prilagođava izbor ostalih komponenti.</w:t>
-      </w:r>
-    </w:p>
-    <w:p>
-      <w:pPr>
-        <w:pStyle w:val="Compact"/>
-        <w:numPr>
-          <w:ilvl w:val="0"/>
-          <w:numId w:val="15"/>
-        </w:numPr>
-        <w:ind w:left="426" w:hanging="284"/>
-        <w:jc w:val="both"/>
-        <w:rPr>
-          <w:rFonts w:ascii="Roboto" w:hAnsi="Roboto"/>
-          <w:sz w:val="22"/>
-          <w:szCs w:val="22"/>
-          <w:lang w:val="sr-Latn-RS"/>
-        </w:rPr>
-      </w:pPr>
-      <w:r>
-        <w:rPr>
-          <w:rFonts w:ascii="Roboto" w:hAnsi="Roboto"/>
-          <w:sz w:val="22"/>
-          <w:szCs w:val="22"/>
-          <w:lang w:val="sr-Latn-RS"/>
-        </w:rPr>
-        <w:t>Ako je cilj ispravna kombinacija komponenti, onda dokaži da postoji motor konfiguracija (motor/propeler/broj ćelija baterije) sa potiskom koji zadovoljava minimalni T/W faktor za ukupnu težinu i specifikaciju modela</w:t>
-      </w:r>
-    </w:p>
-    <w:p>
-      <w:pPr>
-        <w:pStyle w:val="Compact"/>
-        <w:numPr>
-          <w:ilvl w:val="0"/>
-          <w:numId w:val="15"/>
-        </w:numPr>
-        <w:ind w:left="426" w:hanging="284"/>
-        <w:jc w:val="both"/>
-        <w:rPr>
-          <w:rFonts w:ascii="Roboto" w:hAnsi="Roboto"/>
-          <w:sz w:val="22"/>
-          <w:szCs w:val="22"/>
-          <w:lang w:val="sr-Latn-RS"/>
-        </w:rPr>
-      </w:pPr>
-      <w:r>
-        <w:rPr>
-          <w:rFonts w:ascii="Roboto" w:hAnsi="Roboto"/>
-          <w:sz w:val="22"/>
-          <w:szCs w:val="22"/>
-          <w:lang w:val="sr-Latn-RS"/>
-        </w:rPr>
-        <w:t>Ako je motor konfiguracija poznata, onda dokaži da postoji ESC čija maksimalna struja je veća od maksimalne struje motora i čiji opseg broja ćelija je kompatibilan sa odabranom motor konfiguracijom</w:t>
-      </w:r>
-    </w:p>
-    <w:p>
-      <w:pPr>
-        <w:pStyle w:val="Compact"/>
-        <w:numPr>
-          <w:ilvl w:val="0"/>
-          <w:numId w:val="15"/>
-        </w:numPr>
-        <w:ind w:left="426" w:hanging="284"/>
-        <w:jc w:val="both"/>
-        <w:rPr>
-          <w:rFonts w:ascii="Roboto" w:hAnsi="Roboto"/>
-          <w:sz w:val="22"/>
-          <w:szCs w:val="22"/>
-          <w:lang w:val="sr-Latn-RS"/>
-        </w:rPr>
-      </w:pPr>
-      <w:r>
-        <w:rPr>
-          <w:rFonts w:ascii="Roboto" w:hAnsi="Roboto"/>
-          <w:sz w:val="22"/>
-          <w:szCs w:val="22"/>
-          <w:lang w:val="sr-Latn-RS"/>
-        </w:rPr>
-        <w:t>Ako je ESC poznat, onda dokaži da postoje servoi odgovarajuće kategorije veličine za dati model, uz poštovanje preferencije tipa zupčanika</w:t>
-      </w:r>
-    </w:p>
-    <w:p>
-      <w:pPr>
-        <w:pStyle w:val="Compact"/>
-        <w:numPr>
-          <w:ilvl w:val="0"/>
-          <w:numId w:val="15"/>
-        </w:numPr>
-        <w:ind w:left="426" w:hanging="284"/>
-        <w:jc w:val="both"/>
-        <w:rPr>
-          <w:rFonts w:ascii="Roboto" w:hAnsi="Roboto"/>
-          <w:sz w:val="22"/>
-          <w:szCs w:val="22"/>
-          <w:lang w:val="sr-Latn-RS"/>
-        </w:rPr>
-      </w:pPr>
-      <w:r>
-        <w:rPr>
-          <w:rFonts w:ascii="Roboto" w:hAnsi="Roboto"/>
-          <w:sz w:val="22"/>
-          <w:szCs w:val="22"/>
-          <w:lang w:val="sr-Latn-RS"/>
-        </w:rPr>
-        <w:t>Ako su servoi poznati, onda dokaži da postoji baterija čiji broj ćelija odgovara motor konfiguraciji, čija maksimalna izlazna struja pokriva ukupnu maksimalnu potrošnju modela i ima dovoljan kapacitet ako je zadato minimalno vreme letenja</w:t>
-      </w:r>
-    </w:p>
-    <w:p>
-      <w:pPr>
-        <w:pStyle w:val="Compact"/>
-        <w:numPr>
-          <w:ilvl w:val="0"/>
-          <w:numId w:val="15"/>
-        </w:numPr>
-        <w:ind w:left="426" w:hanging="284"/>
-        <w:jc w:val="both"/>
-        <w:rPr>
-          <w:rFonts w:ascii="Roboto" w:hAnsi="Roboto"/>
-          <w:sz w:val="22"/>
-          <w:szCs w:val="22"/>
-          <w:lang w:val="sr-Latn-RS"/>
-        </w:rPr>
-      </w:pPr>
-      <w:r>
-        <w:rPr>
-          <w:rFonts w:ascii="Roboto" w:hAnsi="Roboto"/>
-          <w:sz w:val="22"/>
-          <w:szCs w:val="22"/>
-          <w:lang w:val="sr-Latn-RS"/>
-        </w:rPr>
-        <w:t>Ako nije moguće dokazati postojanje ispravne kombinacije komponenti, onda vrati obrazloženje koji podcilj nije moguće ispuniti</w:t>
-      </w:r>
-    </w:p>
-    <w:p>
-      <w:pPr>
-        <w:pStyle w:val="FirstParagraph"/>
-        <w:jc w:val="both"/>
-        <w:rPr>
-          <w:rFonts w:ascii="Roboto" w:hAnsi="Roboto"/>
-          <w:sz w:val="22"/>
-          <w:szCs w:val="22"/>
-          <w:lang w:val="sr-Latn-RS"/>
-        </w:rPr>
-      </w:pPr>
-      <w:r>
-        <w:rPr>
-          <w:rFonts w:ascii="Roboto" w:hAnsi="Roboto"/>
-          <w:sz w:val="22"/>
-          <w:szCs w:val="22"/>
-          <w:lang w:val="sr-Latn-RS"/>
-        </w:rPr>
-        <w:t>Sistem može generisati različite validne kombinacije u zavisnosti od odabranog prioriteta — minimalna cena, minimalna težina, maksimalno vreme letenja ili maksimalni T/W faktor.</w:t>
-      </w:r>
-    </w:p>
-    <w:p>
-      <w:pPr>
-        <w:pStyle w:val="Heading4"/>
-        <w:spacing w:before="280"/>
-        <w:jc w:val="both"/>
+        <w:t xml:space="preserve"> </w:t>
+      </w:r>
+      <w:proofErr w:type="spellStart"/>
+      <w:r>
         <w:rPr>
           <w:rFonts w:ascii="Roboto" w:hAnsi="Roboto"/>
           <w:b/>
@@ -4135,10 +3981,1077 @@
           <w:szCs w:val="22"/>
           <w:lang w:val="sr-Latn-RS"/>
         </w:rPr>
-      </w:pPr>
-      <w:bookmarkStart w:id="11" w:name="cep"/>
-      <w:bookmarkEnd w:id="10"/>
-      <w:r>
+        <w:t>chaining</w:t>
+      </w:r>
+      <w:proofErr w:type="spellEnd"/>
+    </w:p>
+    <w:p>
+      <w:pPr>
+        <w:pStyle w:val="FirstParagraph"/>
+        <w:jc w:val="both"/>
+        <w:rPr>
+          <w:rFonts w:ascii="Roboto" w:hAnsi="Roboto"/>
+          <w:sz w:val="22"/>
+          <w:szCs w:val="22"/>
+          <w:lang w:val="sr-Latn-RS"/>
+        </w:rPr>
+      </w:pPr>
+      <w:proofErr w:type="spellStart"/>
+      <w:r>
+        <w:rPr>
+          <w:rFonts w:ascii="Roboto" w:hAnsi="Roboto"/>
+          <w:sz w:val="22"/>
+          <w:szCs w:val="22"/>
+          <w:lang w:val="sr-Latn-RS"/>
+        </w:rPr>
+        <w:t>Forward</w:t>
+      </w:r>
+      <w:proofErr w:type="spellEnd"/>
+      <w:r>
+        <w:rPr>
+          <w:rFonts w:ascii="Roboto" w:hAnsi="Roboto"/>
+          <w:sz w:val="22"/>
+          <w:szCs w:val="22"/>
+          <w:lang w:val="sr-Latn-RS"/>
+        </w:rPr>
+        <w:t xml:space="preserve"> </w:t>
+      </w:r>
+      <w:proofErr w:type="spellStart"/>
+      <w:r>
+        <w:rPr>
+          <w:rFonts w:ascii="Roboto" w:hAnsi="Roboto"/>
+          <w:sz w:val="22"/>
+          <w:szCs w:val="22"/>
+          <w:lang w:val="sr-Latn-RS"/>
+        </w:rPr>
+        <w:t>chaining</w:t>
+      </w:r>
+      <w:proofErr w:type="spellEnd"/>
+      <w:r>
+        <w:rPr>
+          <w:rFonts w:ascii="Roboto" w:hAnsi="Roboto"/>
+          <w:sz w:val="22"/>
+          <w:szCs w:val="22"/>
+          <w:lang w:val="sr-Latn-RS"/>
+        </w:rPr>
+        <w:t xml:space="preserve"> se primenjuje nakon što je kombinacija komponenti poznata. Na osnovu odabranih komponenti sistem određuje da li su one međusobno kompatibilne, da li je kombinacija zadovoljavajuća za odabrani model, kao i da li u narednim danima postoji prikladan termin za letenje.</w:t>
+      </w:r>
+      <w:r>
+        <w:rPr>
+          <w:rFonts w:ascii="Roboto" w:hAnsi="Roboto"/>
+          <w:sz w:val="22"/>
+          <w:szCs w:val="22"/>
+          <w:lang w:val="sr-Latn-RS"/>
+        </w:rPr>
+        <w:t xml:space="preserve"> </w:t>
+      </w:r>
+      <w:r>
+        <w:rPr>
+          <w:rFonts w:ascii="Roboto" w:hAnsi="Roboto"/>
+          <w:sz w:val="22"/>
+          <w:szCs w:val="22"/>
+          <w:lang w:val="sr-Latn-RS"/>
+        </w:rPr>
+        <w:t>Pravila su organizovana u tri nivoa:</w:t>
+      </w:r>
+    </w:p>
+    <w:p>
+      <w:pPr>
+        <w:pStyle w:val="BodyText"/>
+        <w:spacing w:after="80"/>
+        <w:jc w:val="both"/>
+        <w:rPr>
+          <w:rFonts w:ascii="Roboto" w:hAnsi="Roboto"/>
+          <w:sz w:val="22"/>
+          <w:szCs w:val="22"/>
+          <w:lang w:val="sr-Latn-RS"/>
+        </w:rPr>
+      </w:pPr>
+      <w:r>
+        <w:rPr>
+          <w:rFonts w:ascii="Roboto" w:hAnsi="Roboto"/>
+          <w:b/>
+          <w:bCs/>
+          <w:sz w:val="22"/>
+          <w:szCs w:val="22"/>
+          <w:lang w:val="sr-Latn-RS"/>
+        </w:rPr>
+        <w:t>Nivo 1</w:t>
+      </w:r>
+      <w:r>
+        <w:rPr>
+          <w:rFonts w:ascii="Roboto" w:hAnsi="Roboto"/>
+          <w:sz w:val="22"/>
+          <w:szCs w:val="22"/>
+          <w:lang w:val="sr-Latn-RS"/>
+        </w:rPr>
+        <w:t xml:space="preserve"> — korekcija težine, računanje ukupne mase i potrošnje modela</w:t>
+      </w:r>
+    </w:p>
+    <w:p>
+      <w:pPr>
+        <w:pStyle w:val="Compact"/>
+        <w:numPr>
+          <w:ilvl w:val="0"/>
+          <w:numId w:val="12"/>
+        </w:numPr>
+        <w:ind w:left="426" w:hanging="284"/>
+        <w:jc w:val="both"/>
+        <w:rPr>
+          <w:rFonts w:ascii="Roboto" w:hAnsi="Roboto"/>
+          <w:sz w:val="22"/>
+          <w:szCs w:val="22"/>
+          <w:lang w:val="sr-Latn-RS"/>
+        </w:rPr>
+      </w:pPr>
+      <w:r>
+        <w:rPr>
+          <w:rFonts w:ascii="Roboto" w:hAnsi="Roboto"/>
+          <w:sz w:val="22"/>
+          <w:szCs w:val="22"/>
+          <w:lang w:val="sr-Latn-RS"/>
+        </w:rPr>
+        <w:t xml:space="preserve">Ako je težina korisnikove karton pene različita od referentne (2.927 g/dm²), onda se model koriguje tako što se referentni </w:t>
+      </w:r>
+      <w:proofErr w:type="spellStart"/>
+      <w:r>
+        <w:rPr>
+          <w:rFonts w:ascii="Roboto" w:hAnsi="Roboto"/>
+          <w:sz w:val="22"/>
+          <w:szCs w:val="22"/>
+          <w:lang w:val="sr-Latn-RS"/>
+        </w:rPr>
+        <w:t>dry</w:t>
+      </w:r>
+      <w:proofErr w:type="spellEnd"/>
+      <w:r>
+        <w:rPr>
+          <w:rFonts w:ascii="Roboto" w:hAnsi="Roboto"/>
+          <w:sz w:val="22"/>
+          <w:szCs w:val="22"/>
+          <w:lang w:val="sr-Latn-RS"/>
+        </w:rPr>
+        <w:t xml:space="preserve"> </w:t>
+      </w:r>
+      <w:proofErr w:type="spellStart"/>
+      <w:r>
+        <w:rPr>
+          <w:rFonts w:ascii="Roboto" w:hAnsi="Roboto"/>
+          <w:sz w:val="22"/>
+          <w:szCs w:val="22"/>
+          <w:lang w:val="sr-Latn-RS"/>
+        </w:rPr>
+        <w:t>weight</w:t>
+      </w:r>
+      <w:proofErr w:type="spellEnd"/>
+      <w:r>
+        <w:rPr>
+          <w:rFonts w:ascii="Roboto" w:hAnsi="Roboto"/>
+          <w:sz w:val="22"/>
+          <w:szCs w:val="22"/>
+          <w:lang w:val="sr-Latn-RS"/>
+        </w:rPr>
+        <w:t xml:space="preserve"> </w:t>
+      </w:r>
+      <w:proofErr w:type="spellStart"/>
+      <w:r>
+        <w:rPr>
+          <w:rFonts w:ascii="Roboto" w:hAnsi="Roboto"/>
+          <w:sz w:val="22"/>
+          <w:szCs w:val="22"/>
+          <w:lang w:val="sr-Latn-RS"/>
+        </w:rPr>
+        <w:t>skalira</w:t>
+      </w:r>
+      <w:proofErr w:type="spellEnd"/>
+      <w:r>
+        <w:rPr>
+          <w:rFonts w:ascii="Roboto" w:hAnsi="Roboto"/>
+          <w:sz w:val="22"/>
+          <w:szCs w:val="22"/>
+          <w:lang w:val="sr-Latn-RS"/>
+        </w:rPr>
+        <w:t xml:space="preserve"> u odnosu na unetu težinu karton pene</w:t>
+      </w:r>
+    </w:p>
+    <w:p>
+      <w:pPr>
+        <w:pStyle w:val="Compact"/>
+        <w:numPr>
+          <w:ilvl w:val="0"/>
+          <w:numId w:val="12"/>
+        </w:numPr>
+        <w:ind w:left="426" w:hanging="284"/>
+        <w:jc w:val="both"/>
+        <w:rPr>
+          <w:rFonts w:ascii="Roboto" w:hAnsi="Roboto"/>
+          <w:sz w:val="22"/>
+          <w:szCs w:val="22"/>
+          <w:lang w:val="sr-Latn-RS"/>
+        </w:rPr>
+      </w:pPr>
+      <w:r>
+        <w:rPr>
+          <w:rFonts w:ascii="Roboto" w:hAnsi="Roboto"/>
+          <w:sz w:val="22"/>
+          <w:szCs w:val="22"/>
+          <w:lang w:val="sr-Latn-RS"/>
+        </w:rPr>
+        <w:t xml:space="preserve">Ako je faktor </w:t>
+      </w:r>
+      <w:proofErr w:type="spellStart"/>
+      <w:r>
+        <w:rPr>
+          <w:rFonts w:ascii="Roboto" w:hAnsi="Roboto"/>
+          <w:sz w:val="22"/>
+          <w:szCs w:val="22"/>
+          <w:lang w:val="sr-Latn-RS"/>
+        </w:rPr>
+        <w:t>skaliranja</w:t>
+      </w:r>
+      <w:proofErr w:type="spellEnd"/>
+      <w:r>
+        <w:rPr>
+          <w:rFonts w:ascii="Roboto" w:hAnsi="Roboto"/>
+          <w:sz w:val="22"/>
+          <w:szCs w:val="22"/>
+          <w:lang w:val="sr-Latn-RS"/>
+        </w:rPr>
+        <w:t xml:space="preserve"> različit od 1, </w:t>
+      </w:r>
+      <w:r>
+        <w:rPr>
+          <w:rFonts w:ascii="Roboto" w:hAnsi="Roboto"/>
+          <w:sz w:val="22"/>
+          <w:szCs w:val="22"/>
+          <w:lang w:val="sr-Latn-RS"/>
+        </w:rPr>
+        <w:t xml:space="preserve">onda model se koriguje tako što se </w:t>
+      </w:r>
+      <w:proofErr w:type="spellStart"/>
+      <w:r>
+        <w:rPr>
+          <w:rFonts w:ascii="Roboto" w:hAnsi="Roboto"/>
+          <w:sz w:val="22"/>
+          <w:szCs w:val="22"/>
+          <w:lang w:val="sr-Latn-RS"/>
+        </w:rPr>
+        <w:t>dry</w:t>
+      </w:r>
+      <w:proofErr w:type="spellEnd"/>
+      <w:r>
+        <w:rPr>
+          <w:rFonts w:ascii="Roboto" w:hAnsi="Roboto"/>
+          <w:sz w:val="22"/>
+          <w:szCs w:val="22"/>
+          <w:lang w:val="sr-Latn-RS"/>
+        </w:rPr>
+        <w:t xml:space="preserve"> </w:t>
+      </w:r>
+      <w:proofErr w:type="spellStart"/>
+      <w:r>
+        <w:rPr>
+          <w:rFonts w:ascii="Roboto" w:hAnsi="Roboto"/>
+          <w:sz w:val="22"/>
+          <w:szCs w:val="22"/>
+          <w:lang w:val="sr-Latn-RS"/>
+        </w:rPr>
+        <w:t>weight</w:t>
+      </w:r>
+      <w:proofErr w:type="spellEnd"/>
+      <w:r>
+        <w:rPr>
+          <w:rFonts w:ascii="Roboto" w:hAnsi="Roboto"/>
+          <w:sz w:val="22"/>
+          <w:szCs w:val="22"/>
+          <w:lang w:val="sr-Latn-RS"/>
+        </w:rPr>
+        <w:t xml:space="preserve"> modela množi sa kvadratom faktora </w:t>
+      </w:r>
+      <w:proofErr w:type="spellStart"/>
+      <w:r>
+        <w:rPr>
+          <w:rFonts w:ascii="Roboto" w:hAnsi="Roboto"/>
+          <w:sz w:val="22"/>
+          <w:szCs w:val="22"/>
+          <w:lang w:val="sr-Latn-RS"/>
+        </w:rPr>
+        <w:t>skaliranja</w:t>
+      </w:r>
+      <w:proofErr w:type="spellEnd"/>
+    </w:p>
+    <w:p>
+      <w:pPr>
+        <w:pStyle w:val="Compact"/>
+        <w:numPr>
+          <w:ilvl w:val="0"/>
+          <w:numId w:val="12"/>
+        </w:numPr>
+        <w:ind w:left="426" w:hanging="284"/>
+        <w:jc w:val="both"/>
+        <w:rPr>
+          <w:rFonts w:ascii="Roboto" w:hAnsi="Roboto"/>
+          <w:sz w:val="22"/>
+          <w:szCs w:val="22"/>
+          <w:lang w:val="sr-Latn-RS"/>
+        </w:rPr>
+      </w:pPr>
+      <w:r>
+        <w:rPr>
+          <w:rFonts w:ascii="Roboto" w:hAnsi="Roboto"/>
+          <w:sz w:val="22"/>
+          <w:szCs w:val="22"/>
+          <w:lang w:val="sr-Latn-RS"/>
+        </w:rPr>
+        <w:t xml:space="preserve">Ako je korigovana težina </w:t>
+      </w:r>
+      <w:proofErr w:type="spellStart"/>
+      <w:r>
+        <w:rPr>
+          <w:rFonts w:ascii="Roboto" w:hAnsi="Roboto"/>
+          <w:sz w:val="22"/>
+          <w:szCs w:val="22"/>
+          <w:lang w:val="sr-Latn-RS"/>
+        </w:rPr>
+        <w:t>airframe</w:t>
+      </w:r>
+      <w:proofErr w:type="spellEnd"/>
+      <w:r>
+        <w:rPr>
+          <w:rFonts w:ascii="Roboto" w:hAnsi="Roboto"/>
+          <w:sz w:val="22"/>
+          <w:szCs w:val="22"/>
+          <w:lang w:val="sr-Latn-RS"/>
+        </w:rPr>
+        <w:t xml:space="preserve">-a izračunata, onda se uz pomoć </w:t>
+      </w:r>
+      <w:proofErr w:type="spellStart"/>
+      <w:r>
+        <w:rPr>
+          <w:rStyle w:val="VerbatimChar"/>
+          <w:rFonts w:ascii="Roboto" w:hAnsi="Roboto"/>
+          <w:sz w:val="20"/>
+          <w:szCs w:val="22"/>
+          <w:lang w:val="sr-Latn-RS"/>
+        </w:rPr>
+        <w:t>accumulate</w:t>
+      </w:r>
+      <w:proofErr w:type="spellEnd"/>
+      <w:r>
+        <w:rPr>
+          <w:rFonts w:ascii="Roboto" w:hAnsi="Roboto"/>
+          <w:sz w:val="22"/>
+          <w:szCs w:val="22"/>
+          <w:lang w:val="sr-Latn-RS"/>
+        </w:rPr>
+        <w:t xml:space="preserve"> funkcije sabira sa težinama svih odabranih komponenti i dobija ukupna težina modela</w:t>
+      </w:r>
+    </w:p>
+    <w:p>
+      <w:pPr>
+        <w:pStyle w:val="Compact"/>
+        <w:numPr>
+          <w:ilvl w:val="0"/>
+          <w:numId w:val="12"/>
+        </w:numPr>
+        <w:ind w:left="426" w:hanging="284"/>
+        <w:jc w:val="both"/>
+        <w:rPr>
+          <w:rFonts w:ascii="Roboto" w:hAnsi="Roboto"/>
+          <w:sz w:val="22"/>
+          <w:szCs w:val="22"/>
+          <w:lang w:val="sr-Latn-RS"/>
+        </w:rPr>
+      </w:pPr>
+      <w:r>
+        <w:rPr>
+          <w:rFonts w:ascii="Roboto" w:hAnsi="Roboto"/>
+          <w:sz w:val="22"/>
+          <w:szCs w:val="22"/>
+          <w:lang w:val="sr-Latn-RS"/>
+        </w:rPr>
+        <w:t xml:space="preserve">Ako su sve komponente odabrane, onda se </w:t>
+      </w:r>
+      <w:proofErr w:type="spellStart"/>
+      <w:r>
+        <w:rPr>
+          <w:rStyle w:val="VerbatimChar"/>
+          <w:rFonts w:ascii="Roboto" w:hAnsi="Roboto"/>
+          <w:sz w:val="20"/>
+          <w:szCs w:val="22"/>
+          <w:lang w:val="sr-Latn-RS"/>
+        </w:rPr>
+        <w:t>accumulate</w:t>
+      </w:r>
+      <w:proofErr w:type="spellEnd"/>
+      <w:r>
+        <w:rPr>
+          <w:rFonts w:ascii="Roboto" w:hAnsi="Roboto"/>
+          <w:sz w:val="22"/>
+          <w:szCs w:val="22"/>
+          <w:lang w:val="sr-Latn-RS"/>
+        </w:rPr>
+        <w:t xml:space="preserve"> funkcijom sabira maksimalna potrošnja svih komponenti (motor, </w:t>
+      </w:r>
+      <w:proofErr w:type="spellStart"/>
+      <w:r>
+        <w:rPr>
+          <w:rFonts w:ascii="Roboto" w:hAnsi="Roboto"/>
+          <w:sz w:val="22"/>
+          <w:szCs w:val="22"/>
+          <w:lang w:val="sr-Latn-RS"/>
+        </w:rPr>
+        <w:t>servoi</w:t>
+      </w:r>
+      <w:proofErr w:type="spellEnd"/>
+      <w:r>
+        <w:rPr>
+          <w:rFonts w:ascii="Roboto" w:hAnsi="Roboto"/>
+          <w:sz w:val="22"/>
+          <w:szCs w:val="22"/>
+          <w:lang w:val="sr-Latn-RS"/>
+        </w:rPr>
+        <w:t>, prijemnik) i dobija ukupna maksimalna potrošnja modela</w:t>
+      </w:r>
+    </w:p>
+    <w:p>
+      <w:pPr>
+        <w:pStyle w:val="FirstParagraph"/>
+        <w:spacing w:after="80"/>
+        <w:jc w:val="both"/>
+        <w:rPr>
+          <w:rFonts w:ascii="Roboto" w:hAnsi="Roboto"/>
+          <w:sz w:val="22"/>
+          <w:szCs w:val="22"/>
+          <w:lang w:val="sr-Latn-RS"/>
+        </w:rPr>
+      </w:pPr>
+      <w:r>
+        <w:rPr>
+          <w:rFonts w:ascii="Roboto" w:hAnsi="Roboto"/>
+          <w:b/>
+          <w:bCs/>
+          <w:sz w:val="22"/>
+          <w:szCs w:val="22"/>
+          <w:lang w:val="sr-Latn-RS"/>
+        </w:rPr>
+        <w:t>Nivo 2</w:t>
+      </w:r>
+      <w:r>
+        <w:rPr>
+          <w:rFonts w:ascii="Roboto" w:hAnsi="Roboto"/>
+          <w:sz w:val="22"/>
+          <w:szCs w:val="22"/>
+          <w:lang w:val="sr-Latn-RS"/>
+        </w:rPr>
+        <w:t xml:space="preserve"> — provera ispravnosti kombinacije komponenti</w:t>
+      </w:r>
+    </w:p>
+    <w:p>
+      <w:pPr>
+        <w:pStyle w:val="Compact"/>
+        <w:numPr>
+          <w:ilvl w:val="0"/>
+          <w:numId w:val="13"/>
+        </w:numPr>
+        <w:ind w:left="426" w:hanging="284"/>
+        <w:jc w:val="both"/>
+        <w:rPr>
+          <w:rFonts w:ascii="Roboto" w:hAnsi="Roboto"/>
+          <w:sz w:val="22"/>
+          <w:szCs w:val="22"/>
+          <w:lang w:val="sr-Latn-RS"/>
+        </w:rPr>
+      </w:pPr>
+      <w:r>
+        <w:rPr>
+          <w:rFonts w:ascii="Roboto" w:hAnsi="Roboto"/>
+          <w:sz w:val="22"/>
+          <w:szCs w:val="22"/>
+          <w:lang w:val="sr-Latn-RS"/>
+        </w:rPr>
+        <w:t>Ako je ukupna težina modela poznata, onda se računa odnos težine i potiska odabrane motor konfiguracije (T/W faktor)</w:t>
+      </w:r>
+    </w:p>
+    <w:p>
+      <w:pPr>
+        <w:pStyle w:val="Compact"/>
+        <w:numPr>
+          <w:ilvl w:val="0"/>
+          <w:numId w:val="13"/>
+        </w:numPr>
+        <w:ind w:left="426" w:hanging="284"/>
+        <w:jc w:val="both"/>
+        <w:rPr>
+          <w:rFonts w:ascii="Roboto" w:hAnsi="Roboto"/>
+          <w:sz w:val="22"/>
+          <w:szCs w:val="22"/>
+          <w:lang w:val="sr-Latn-RS"/>
+        </w:rPr>
+      </w:pPr>
+      <w:r>
+        <w:rPr>
+          <w:rFonts w:ascii="Roboto" w:hAnsi="Roboto"/>
+          <w:sz w:val="22"/>
+          <w:szCs w:val="22"/>
+          <w:lang w:val="sr-Latn-RS"/>
+        </w:rPr>
+        <w:t xml:space="preserve">Ako je ukupna težina modela poznata, onda se računa WCL faktor kao količnik ukupne težine modela i površine krila prilagođene faktoru </w:t>
+      </w:r>
+      <w:proofErr w:type="spellStart"/>
+      <w:r>
+        <w:rPr>
+          <w:rFonts w:ascii="Roboto" w:hAnsi="Roboto"/>
+          <w:sz w:val="22"/>
+          <w:szCs w:val="22"/>
+          <w:lang w:val="sr-Latn-RS"/>
+        </w:rPr>
+        <w:t>skaliranja</w:t>
+      </w:r>
+      <w:proofErr w:type="spellEnd"/>
+      <w:r>
+        <w:rPr>
+          <w:rFonts w:ascii="Roboto" w:hAnsi="Roboto"/>
+          <w:sz w:val="22"/>
+          <w:szCs w:val="22"/>
+          <w:lang w:val="sr-Latn-RS"/>
+        </w:rPr>
+        <w:t xml:space="preserve"> stepenovan sa 1.5</w:t>
+      </w:r>
+    </w:p>
+    <w:p>
+      <w:pPr>
+        <w:pStyle w:val="Compact"/>
+        <w:numPr>
+          <w:ilvl w:val="0"/>
+          <w:numId w:val="13"/>
+        </w:numPr>
+        <w:ind w:left="426" w:hanging="284"/>
+        <w:jc w:val="both"/>
+        <w:rPr>
+          <w:rFonts w:ascii="Roboto" w:hAnsi="Roboto"/>
+          <w:sz w:val="22"/>
+          <w:szCs w:val="22"/>
+          <w:lang w:val="sr-Latn-RS"/>
+        </w:rPr>
+      </w:pPr>
+      <w:r>
+        <w:rPr>
+          <w:rFonts w:ascii="Roboto" w:hAnsi="Roboto"/>
+          <w:sz w:val="22"/>
+          <w:szCs w:val="22"/>
+          <w:lang w:val="sr-Latn-RS"/>
+        </w:rPr>
+        <w:t>Ako je ukupna maksimalna potrošnja modela poznata, onda se računa procenjeno minimalno vreme letenja kao količnik kapaciteta baterije i ukupne maksimalne potrošnje</w:t>
+      </w:r>
+    </w:p>
+    <w:p>
+      <w:pPr>
+        <w:pStyle w:val="Compact"/>
+        <w:numPr>
+          <w:ilvl w:val="0"/>
+          <w:numId w:val="13"/>
+        </w:numPr>
+        <w:ind w:left="426" w:hanging="284"/>
+        <w:jc w:val="both"/>
+        <w:rPr>
+          <w:rFonts w:ascii="Roboto" w:hAnsi="Roboto"/>
+          <w:sz w:val="22"/>
+          <w:szCs w:val="22"/>
+          <w:lang w:val="sr-Latn-RS"/>
+        </w:rPr>
+      </w:pPr>
+      <w:r>
+        <w:rPr>
+          <w:rFonts w:ascii="Roboto" w:hAnsi="Roboto"/>
+          <w:sz w:val="22"/>
+          <w:szCs w:val="22"/>
+          <w:lang w:val="sr-Latn-RS"/>
+        </w:rPr>
+        <w:t xml:space="preserve">Ako je maksimalna izlazna struja baterije (kapacitet × C </w:t>
+      </w:r>
+      <w:proofErr w:type="spellStart"/>
+      <w:r>
+        <w:rPr>
+          <w:rFonts w:ascii="Roboto" w:hAnsi="Roboto"/>
+          <w:sz w:val="22"/>
+          <w:szCs w:val="22"/>
+          <w:lang w:val="sr-Latn-RS"/>
+        </w:rPr>
+        <w:t>rating</w:t>
+      </w:r>
+      <w:proofErr w:type="spellEnd"/>
+      <w:r>
+        <w:rPr>
+          <w:rFonts w:ascii="Roboto" w:hAnsi="Roboto"/>
+          <w:sz w:val="22"/>
+          <w:szCs w:val="22"/>
+          <w:lang w:val="sr-Latn-RS"/>
+        </w:rPr>
+        <w:t>) manja od ukupne maksimalne potrošnje, onda se generiše upozorenje o nekompatibilnoj bateriji</w:t>
+      </w:r>
+    </w:p>
+    <w:p>
+      <w:pPr>
+        <w:pStyle w:val="Compact"/>
+        <w:numPr>
+          <w:ilvl w:val="0"/>
+          <w:numId w:val="13"/>
+        </w:numPr>
+        <w:ind w:left="426" w:hanging="284"/>
+        <w:jc w:val="both"/>
+        <w:rPr>
+          <w:rFonts w:ascii="Roboto" w:hAnsi="Roboto"/>
+          <w:sz w:val="22"/>
+          <w:szCs w:val="22"/>
+          <w:lang w:val="sr-Latn-RS"/>
+        </w:rPr>
+      </w:pPr>
+      <w:r>
+        <w:rPr>
+          <w:rFonts w:ascii="Roboto" w:hAnsi="Roboto"/>
+          <w:sz w:val="22"/>
+          <w:szCs w:val="22"/>
+          <w:lang w:val="sr-Latn-RS"/>
+        </w:rPr>
+        <w:t>Ako je maksimalna struja ESC-a manja od maksimalne struje motora, onda se generiše upozorenje o nekompatibilnom ESC-u</w:t>
+      </w:r>
+    </w:p>
+    <w:p>
+      <w:pPr>
+        <w:pStyle w:val="Compact"/>
+        <w:numPr>
+          <w:ilvl w:val="0"/>
+          <w:numId w:val="13"/>
+        </w:numPr>
+        <w:ind w:left="426" w:hanging="284"/>
+        <w:jc w:val="both"/>
+        <w:rPr>
+          <w:rFonts w:ascii="Roboto" w:hAnsi="Roboto"/>
+          <w:sz w:val="22"/>
+          <w:szCs w:val="22"/>
+          <w:lang w:val="sr-Latn-RS"/>
+        </w:rPr>
+      </w:pPr>
+      <w:r>
+        <w:rPr>
+          <w:rFonts w:ascii="Roboto" w:hAnsi="Roboto"/>
+          <w:sz w:val="22"/>
+          <w:szCs w:val="22"/>
+          <w:lang w:val="sr-Latn-RS"/>
+        </w:rPr>
+        <w:t xml:space="preserve">Ako je BEC maksimalna struja manja od ukupne potrošnje </w:t>
+      </w:r>
+      <w:proofErr w:type="spellStart"/>
+      <w:r>
+        <w:rPr>
+          <w:rFonts w:ascii="Roboto" w:hAnsi="Roboto"/>
+          <w:sz w:val="22"/>
+          <w:szCs w:val="22"/>
+          <w:lang w:val="sr-Latn-RS"/>
+        </w:rPr>
+        <w:t>servoa</w:t>
+      </w:r>
+      <w:proofErr w:type="spellEnd"/>
+      <w:r>
+        <w:rPr>
+          <w:rFonts w:ascii="Roboto" w:hAnsi="Roboto"/>
+          <w:sz w:val="22"/>
+          <w:szCs w:val="22"/>
+          <w:lang w:val="sr-Latn-RS"/>
+        </w:rPr>
+        <w:t xml:space="preserve"> i prijemnika, onda se generiše upozorenje o nekompatibilnom BEC-u</w:t>
+      </w:r>
+    </w:p>
+    <w:p>
+      <w:pPr>
+        <w:pStyle w:val="Compact"/>
+        <w:numPr>
+          <w:ilvl w:val="0"/>
+          <w:numId w:val="13"/>
+        </w:numPr>
+        <w:ind w:left="426" w:hanging="284"/>
+        <w:jc w:val="both"/>
+        <w:rPr>
+          <w:rFonts w:ascii="Roboto" w:hAnsi="Roboto"/>
+          <w:sz w:val="22"/>
+          <w:szCs w:val="22"/>
+          <w:lang w:val="sr-Latn-RS"/>
+        </w:rPr>
+      </w:pPr>
+      <w:r>
+        <w:rPr>
+          <w:rFonts w:ascii="Roboto" w:hAnsi="Roboto"/>
+          <w:sz w:val="22"/>
+          <w:szCs w:val="22"/>
+          <w:lang w:val="sr-Latn-RS"/>
+        </w:rPr>
+        <w:t>Ako je zadato minimalno vreme letenja i procenjeno vreme letenja je manje od njega, onda se generiše upozorenje o premalom kapacitetu baterije</w:t>
+      </w:r>
+    </w:p>
+    <w:p>
+      <w:pPr>
+        <w:pStyle w:val="FirstParagraph"/>
+        <w:spacing w:after="80"/>
+        <w:jc w:val="both"/>
+        <w:rPr>
+          <w:rFonts w:ascii="Roboto" w:hAnsi="Roboto"/>
+          <w:sz w:val="22"/>
+          <w:szCs w:val="22"/>
+          <w:lang w:val="sr-Latn-RS"/>
+        </w:rPr>
+      </w:pPr>
+      <w:r>
+        <w:rPr>
+          <w:rFonts w:ascii="Roboto" w:hAnsi="Roboto"/>
+          <w:b/>
+          <w:bCs/>
+          <w:sz w:val="22"/>
+          <w:szCs w:val="22"/>
+          <w:lang w:val="sr-Latn-RS"/>
+        </w:rPr>
+        <w:t>Nivo 3</w:t>
+      </w:r>
+      <w:r>
+        <w:rPr>
+          <w:rFonts w:ascii="Roboto" w:hAnsi="Roboto"/>
+          <w:sz w:val="22"/>
+          <w:szCs w:val="22"/>
+          <w:lang w:val="sr-Latn-RS"/>
+        </w:rPr>
+        <w:t xml:space="preserve"> — klasifikacija modela i preporuka termina letenja</w:t>
+      </w:r>
+    </w:p>
+    <w:p>
+      <w:pPr>
+        <w:pStyle w:val="Compact"/>
+        <w:numPr>
+          <w:ilvl w:val="0"/>
+          <w:numId w:val="14"/>
+        </w:numPr>
+        <w:ind w:left="426" w:hanging="284"/>
+        <w:jc w:val="both"/>
+        <w:rPr>
+          <w:rFonts w:ascii="Roboto" w:hAnsi="Roboto"/>
+          <w:sz w:val="22"/>
+          <w:szCs w:val="22"/>
+          <w:lang w:val="sr-Latn-RS"/>
+        </w:rPr>
+      </w:pPr>
+      <w:r>
+        <w:rPr>
+          <w:rFonts w:ascii="Roboto" w:hAnsi="Roboto"/>
+          <w:sz w:val="22"/>
+          <w:szCs w:val="22"/>
+          <w:lang w:val="sr-Latn-RS"/>
+        </w:rPr>
+        <w:t>Ako je T/W faktor manji od minimalnog zadatog, onda se generiše upozorenje o nedovoljnom potisku (loš izbor motora, propelera ili baterije)</w:t>
+      </w:r>
+    </w:p>
+    <w:p>
+      <w:pPr>
+        <w:pStyle w:val="Compact"/>
+        <w:numPr>
+          <w:ilvl w:val="0"/>
+          <w:numId w:val="14"/>
+        </w:numPr>
+        <w:ind w:left="426" w:hanging="284"/>
+        <w:jc w:val="both"/>
+        <w:rPr>
+          <w:rFonts w:ascii="Roboto" w:hAnsi="Roboto"/>
+          <w:sz w:val="22"/>
+          <w:szCs w:val="22"/>
+          <w:lang w:val="sr-Latn-RS"/>
+        </w:rPr>
+      </w:pPr>
+      <w:r>
+        <w:rPr>
+          <w:rFonts w:ascii="Roboto" w:hAnsi="Roboto"/>
+          <w:sz w:val="22"/>
+          <w:szCs w:val="22"/>
+          <w:lang w:val="sr-Latn-RS"/>
+        </w:rPr>
+        <w:t xml:space="preserve">Ako su T/W i WCL faktori izračunati i T/W zadovoljava minimum, onda se na osnovu WCL faktora i odnosa izračunatog i preporučenog T/W faktora određuje klasa </w:t>
+      </w:r>
+      <w:proofErr w:type="spellStart"/>
+      <w:r>
+        <w:rPr>
+          <w:rFonts w:ascii="Roboto" w:hAnsi="Roboto"/>
+          <w:sz w:val="22"/>
+          <w:szCs w:val="22"/>
+          <w:lang w:val="sr-Latn-RS"/>
+        </w:rPr>
+        <w:t>manevrabilnosti</w:t>
+      </w:r>
+      <w:proofErr w:type="spellEnd"/>
+      <w:r>
+        <w:rPr>
+          <w:rFonts w:ascii="Roboto" w:hAnsi="Roboto"/>
+          <w:sz w:val="22"/>
+          <w:szCs w:val="22"/>
+          <w:lang w:val="sr-Latn-RS"/>
+        </w:rPr>
+        <w:t xml:space="preserve"> modela</w:t>
+      </w:r>
+    </w:p>
+    <w:p>
+      <w:pPr>
+        <w:pStyle w:val="Compact"/>
+        <w:numPr>
+          <w:ilvl w:val="0"/>
+          <w:numId w:val="14"/>
+        </w:numPr>
+        <w:ind w:left="426" w:hanging="284"/>
+        <w:jc w:val="both"/>
+        <w:rPr>
+          <w:rFonts w:ascii="Roboto" w:hAnsi="Roboto"/>
+          <w:sz w:val="22"/>
+          <w:szCs w:val="22"/>
+          <w:lang w:val="sr-Latn-RS"/>
+        </w:rPr>
+      </w:pPr>
+      <w:r>
+        <w:rPr>
+          <w:rFonts w:ascii="Roboto" w:hAnsi="Roboto"/>
+          <w:sz w:val="22"/>
+          <w:szCs w:val="22"/>
+          <w:lang w:val="sr-Latn-RS"/>
+        </w:rPr>
+        <w:t xml:space="preserve">Ako je klasa </w:t>
+      </w:r>
+      <w:proofErr w:type="spellStart"/>
+      <w:r>
+        <w:rPr>
+          <w:rFonts w:ascii="Roboto" w:hAnsi="Roboto"/>
+          <w:sz w:val="22"/>
+          <w:szCs w:val="22"/>
+          <w:lang w:val="sr-Latn-RS"/>
+        </w:rPr>
+        <w:t>manevrabilnosti</w:t>
+      </w:r>
+      <w:proofErr w:type="spellEnd"/>
+      <w:r>
+        <w:rPr>
+          <w:rFonts w:ascii="Roboto" w:hAnsi="Roboto"/>
+          <w:sz w:val="22"/>
+          <w:szCs w:val="22"/>
+          <w:lang w:val="sr-Latn-RS"/>
+        </w:rPr>
+        <w:t xml:space="preserve"> određena, onda se na osnovu nje i ukupne težine modela određuju pragovi prihvatljivosti brzine vetra — donji prag ispod kojeg je vetar idealan i gornji prag iznad kojeg je vetar neprihvatljiv</w:t>
+      </w:r>
+    </w:p>
+    <w:p>
+      <w:pPr>
+        <w:pStyle w:val="Compact"/>
+        <w:numPr>
+          <w:ilvl w:val="0"/>
+          <w:numId w:val="14"/>
+        </w:numPr>
+        <w:ind w:left="426" w:hanging="284"/>
+        <w:jc w:val="both"/>
+        <w:rPr>
+          <w:rFonts w:ascii="Roboto" w:hAnsi="Roboto"/>
+          <w:sz w:val="22"/>
+          <w:szCs w:val="22"/>
+          <w:lang w:val="sr-Latn-RS"/>
+        </w:rPr>
+      </w:pPr>
+      <w:r>
+        <w:rPr>
+          <w:rFonts w:ascii="Roboto" w:hAnsi="Roboto"/>
+          <w:sz w:val="22"/>
+          <w:szCs w:val="22"/>
+          <w:lang w:val="sr-Latn-RS"/>
+        </w:rPr>
+        <w:t>Ako pada kiša, onda se termin označava kao neprikladan</w:t>
+      </w:r>
+    </w:p>
+    <w:p>
+      <w:pPr>
+        <w:pStyle w:val="Compact"/>
+        <w:numPr>
+          <w:ilvl w:val="0"/>
+          <w:numId w:val="14"/>
+        </w:numPr>
+        <w:ind w:left="426" w:hanging="284"/>
+        <w:jc w:val="both"/>
+        <w:rPr>
+          <w:rFonts w:ascii="Roboto" w:hAnsi="Roboto"/>
+          <w:sz w:val="22"/>
+          <w:szCs w:val="22"/>
+          <w:lang w:val="sr-Latn-RS"/>
+        </w:rPr>
+      </w:pPr>
+      <w:r>
+        <w:rPr>
+          <w:rFonts w:ascii="Roboto" w:hAnsi="Roboto"/>
+          <w:sz w:val="22"/>
+          <w:szCs w:val="22"/>
+          <w:lang w:val="sr-Latn-RS"/>
+        </w:rPr>
+        <w:t>Ako je noć, onda se termin označava kao neprikladan</w:t>
+      </w:r>
+    </w:p>
+    <w:p>
+      <w:pPr>
+        <w:pStyle w:val="Compact"/>
+        <w:numPr>
+          <w:ilvl w:val="0"/>
+          <w:numId w:val="14"/>
+        </w:numPr>
+        <w:ind w:left="426" w:hanging="284"/>
+        <w:jc w:val="both"/>
+        <w:rPr>
+          <w:rFonts w:ascii="Roboto" w:hAnsi="Roboto"/>
+          <w:sz w:val="22"/>
+          <w:szCs w:val="22"/>
+          <w:lang w:val="sr-Latn-RS"/>
+        </w:rPr>
+      </w:pPr>
+      <w:r>
+        <w:rPr>
+          <w:rFonts w:ascii="Roboto" w:hAnsi="Roboto"/>
+          <w:sz w:val="22"/>
+          <w:szCs w:val="22"/>
+          <w:lang w:val="sr-Latn-RS"/>
+        </w:rPr>
+        <w:t>Ako je vetar iznad gornjeg praga, onda se termin označava kao neprikladan</w:t>
+      </w:r>
+    </w:p>
+    <w:p>
+      <w:pPr>
+        <w:pStyle w:val="Compact"/>
+        <w:numPr>
+          <w:ilvl w:val="0"/>
+          <w:numId w:val="14"/>
+        </w:numPr>
+        <w:ind w:left="426" w:hanging="284"/>
+        <w:jc w:val="both"/>
+        <w:rPr>
+          <w:rFonts w:ascii="Roboto" w:hAnsi="Roboto"/>
+          <w:sz w:val="22"/>
+          <w:szCs w:val="22"/>
+          <w:lang w:val="sr-Latn-RS"/>
+        </w:rPr>
+      </w:pPr>
+      <w:r>
+        <w:rPr>
+          <w:rFonts w:ascii="Roboto" w:hAnsi="Roboto"/>
+          <w:sz w:val="22"/>
+          <w:szCs w:val="22"/>
+          <w:lang w:val="sr-Latn-RS"/>
+        </w:rPr>
+        <w:t>Ako termin nije neprikladan i nedavno je padala kiša, onda se termin označava kao prihvatljiv</w:t>
+      </w:r>
+    </w:p>
+    <w:p>
+      <w:pPr>
+        <w:pStyle w:val="Compact"/>
+        <w:numPr>
+          <w:ilvl w:val="0"/>
+          <w:numId w:val="14"/>
+        </w:numPr>
+        <w:ind w:left="426" w:hanging="284"/>
+        <w:jc w:val="both"/>
+        <w:rPr>
+          <w:rFonts w:ascii="Roboto" w:hAnsi="Roboto"/>
+          <w:sz w:val="22"/>
+          <w:szCs w:val="22"/>
+          <w:lang w:val="sr-Latn-RS"/>
+        </w:rPr>
+      </w:pPr>
+      <w:r>
+        <w:rPr>
+          <w:rFonts w:ascii="Roboto" w:hAnsi="Roboto"/>
+          <w:sz w:val="22"/>
+          <w:szCs w:val="22"/>
+          <w:lang w:val="sr-Latn-RS"/>
+        </w:rPr>
+        <w:t>Ako termin nije neprikladan i vetar je između donjeg i gornjeg praga, onda se termin označava kao prihvatljiv</w:t>
+      </w:r>
+    </w:p>
+    <w:p>
+      <w:pPr>
+        <w:pStyle w:val="Compact"/>
+        <w:numPr>
+          <w:ilvl w:val="0"/>
+          <w:numId w:val="14"/>
+        </w:numPr>
+        <w:ind w:left="426" w:hanging="284"/>
+        <w:jc w:val="both"/>
+        <w:rPr>
+          <w:rFonts w:ascii="Roboto" w:hAnsi="Roboto"/>
+          <w:sz w:val="22"/>
+          <w:szCs w:val="22"/>
+          <w:lang w:val="sr-Latn-RS"/>
+        </w:rPr>
+      </w:pPr>
+      <w:r>
+        <w:rPr>
+          <w:rFonts w:ascii="Roboto" w:hAnsi="Roboto"/>
+          <w:sz w:val="22"/>
+          <w:szCs w:val="22"/>
+          <w:lang w:val="sr-Latn-RS"/>
+        </w:rPr>
+        <w:t>Ako termin nije neprikladan i temperatura je između prihvatljive i idealne granice, onda se termin označava kao prihvatljiv</w:t>
+      </w:r>
+    </w:p>
+    <w:p>
+      <w:pPr>
+        <w:pStyle w:val="Compact"/>
+        <w:numPr>
+          <w:ilvl w:val="0"/>
+          <w:numId w:val="14"/>
+        </w:numPr>
+        <w:ind w:left="426" w:hanging="284"/>
+        <w:jc w:val="both"/>
+        <w:rPr>
+          <w:rFonts w:ascii="Roboto" w:hAnsi="Roboto"/>
+          <w:sz w:val="22"/>
+          <w:szCs w:val="22"/>
+          <w:lang w:val="sr-Latn-RS"/>
+        </w:rPr>
+      </w:pPr>
+      <w:r>
+        <w:rPr>
+          <w:rFonts w:ascii="Roboto" w:hAnsi="Roboto"/>
+          <w:sz w:val="22"/>
+          <w:szCs w:val="22"/>
+          <w:lang w:val="sr-Latn-RS"/>
+        </w:rPr>
+        <w:t>Ako termin nije neprikladan i termin je blizu zalaska sunca, onda se termin označava kao prihvatljiv</w:t>
+      </w:r>
+    </w:p>
+    <w:p>
+      <w:pPr>
+        <w:pStyle w:val="Compact"/>
+        <w:numPr>
+          <w:ilvl w:val="0"/>
+          <w:numId w:val="14"/>
+        </w:numPr>
+        <w:ind w:left="426" w:hanging="284"/>
+        <w:jc w:val="both"/>
+        <w:rPr>
+          <w:rFonts w:ascii="Roboto" w:hAnsi="Roboto"/>
+          <w:sz w:val="22"/>
+          <w:szCs w:val="22"/>
+          <w:lang w:val="sr-Latn-RS"/>
+        </w:rPr>
+      </w:pPr>
+      <w:r>
+        <w:rPr>
+          <w:rFonts w:ascii="Roboto" w:hAnsi="Roboto"/>
+          <w:sz w:val="22"/>
+          <w:szCs w:val="22"/>
+          <w:lang w:val="sr-Latn-RS"/>
+        </w:rPr>
+        <w:t>Ako termin nije neprikladan, nema nedavnih padavina, vetar je ispod donjeg praga, temperatura je u idealnom opsegu i ima dovoljno dnevnog svetla, onda se termin označava kao idealan</w:t>
+      </w:r>
+    </w:p>
+    <w:p>
+      <w:pPr>
+        <w:pStyle w:val="Heading4"/>
+        <w:jc w:val="both"/>
         <w:rPr>
           <w:rFonts w:ascii="Roboto" w:hAnsi="Roboto"/>
           <w:b/>
@@ -4149,6 +5062,328 @@
           <w:szCs w:val="22"/>
           <w:lang w:val="sr-Latn-RS"/>
         </w:rPr>
+      </w:pPr>
+      <w:bookmarkStart w:id="10" w:name="backward-chaining"/>
+      <w:bookmarkEnd w:id="9"/>
+      <w:r>
+        <w:rPr>
+          <w:rFonts w:ascii="Roboto" w:hAnsi="Roboto"/>
+          <w:b/>
+          <w:bCs w:val="0"/>
+          <w:i w:val="0"/>
+          <w:color w:val="auto"/>
+          <w:sz w:val="22"/>
+          <w:szCs w:val="22"/>
+          <w:lang w:val="sr-Latn-RS"/>
+        </w:rPr>
+        <w:lastRenderedPageBreak/>
+        <w:t xml:space="preserve">3.3.3 </w:t>
+      </w:r>
+      <w:proofErr w:type="spellStart"/>
+      <w:r>
+        <w:rPr>
+          <w:rFonts w:ascii="Roboto" w:hAnsi="Roboto"/>
+          <w:b/>
+          <w:bCs w:val="0"/>
+          <w:i w:val="0"/>
+          <w:color w:val="auto"/>
+          <w:sz w:val="22"/>
+          <w:szCs w:val="22"/>
+          <w:lang w:val="sr-Latn-RS"/>
+        </w:rPr>
+        <w:t>Backward</w:t>
+      </w:r>
+      <w:proofErr w:type="spellEnd"/>
+      <w:r>
+        <w:rPr>
+          <w:rFonts w:ascii="Roboto" w:hAnsi="Roboto"/>
+          <w:b/>
+          <w:bCs w:val="0"/>
+          <w:i w:val="0"/>
+          <w:color w:val="auto"/>
+          <w:sz w:val="22"/>
+          <w:szCs w:val="22"/>
+          <w:lang w:val="sr-Latn-RS"/>
+        </w:rPr>
+        <w:t xml:space="preserve"> </w:t>
+      </w:r>
+      <w:proofErr w:type="spellStart"/>
+      <w:r>
+        <w:rPr>
+          <w:rFonts w:ascii="Roboto" w:hAnsi="Roboto"/>
+          <w:b/>
+          <w:bCs w:val="0"/>
+          <w:i w:val="0"/>
+          <w:color w:val="auto"/>
+          <w:sz w:val="22"/>
+          <w:szCs w:val="22"/>
+          <w:lang w:val="sr-Latn-RS"/>
+        </w:rPr>
+        <w:t>chaining</w:t>
+      </w:r>
+      <w:proofErr w:type="spellEnd"/>
+    </w:p>
+    <w:p>
+      <w:pPr>
+        <w:pStyle w:val="FirstParagraph"/>
+        <w:jc w:val="both"/>
+        <w:rPr>
+          <w:rFonts w:ascii="Roboto" w:hAnsi="Roboto"/>
+          <w:sz w:val="22"/>
+          <w:szCs w:val="22"/>
+          <w:lang w:val="sr-Latn-RS"/>
+        </w:rPr>
+      </w:pPr>
+      <w:r>
+        <w:rPr>
+          <w:rFonts w:ascii="Roboto" w:hAnsi="Roboto"/>
+          <w:sz w:val="22"/>
+          <w:szCs w:val="22"/>
+          <w:lang w:val="sr-Latn-RS"/>
+        </w:rPr>
+        <w:t>Kada korisnik zatraži automatski predlog kombinacije komponenti, sistem unazad dokazuje da za odabrani model postoji ispravna kombinacija komponenti. Komponente koje su nedostupne sistem ne uzima u obzir pri pretrazi, ali korisnik ih može ručno odabrati. Korisnik može zaključati određene komponente, u tom slučaju sistem te komponente ne bira automatski već njima prilagođava izbor ostalih komponenti.</w:t>
+      </w:r>
+    </w:p>
+    <w:p>
+      <w:pPr>
+        <w:pStyle w:val="Compact"/>
+        <w:numPr>
+          <w:ilvl w:val="0"/>
+          <w:numId w:val="15"/>
+        </w:numPr>
+        <w:ind w:left="426" w:hanging="284"/>
+        <w:jc w:val="both"/>
+        <w:rPr>
+          <w:rFonts w:ascii="Roboto" w:hAnsi="Roboto"/>
+          <w:sz w:val="22"/>
+          <w:szCs w:val="22"/>
+          <w:lang w:val="sr-Latn-RS"/>
+        </w:rPr>
+      </w:pPr>
+      <w:r>
+        <w:rPr>
+          <w:rFonts w:ascii="Roboto" w:hAnsi="Roboto"/>
+          <w:sz w:val="22"/>
+          <w:szCs w:val="22"/>
+          <w:lang w:val="sr-Latn-RS"/>
+        </w:rPr>
+        <w:t>Ako je cilj ispravna kombinacija komponenti, onda dokaži da postoji motor konfiguracija (motor/propeler/broj ćelija baterije) sa potiskom koji zadovoljava minimalni T/W faktor za ukupnu težinu i specifikaciju modela</w:t>
+      </w:r>
+    </w:p>
+    <w:p>
+      <w:pPr>
+        <w:pStyle w:val="Compact"/>
+        <w:numPr>
+          <w:ilvl w:val="0"/>
+          <w:numId w:val="15"/>
+        </w:numPr>
+        <w:ind w:left="426" w:hanging="284"/>
+        <w:jc w:val="both"/>
+        <w:rPr>
+          <w:rFonts w:ascii="Roboto" w:hAnsi="Roboto"/>
+          <w:sz w:val="22"/>
+          <w:szCs w:val="22"/>
+          <w:lang w:val="sr-Latn-RS"/>
+        </w:rPr>
+      </w:pPr>
+      <w:r>
+        <w:rPr>
+          <w:rFonts w:ascii="Roboto" w:hAnsi="Roboto"/>
+          <w:sz w:val="22"/>
+          <w:szCs w:val="22"/>
+          <w:lang w:val="sr-Latn-RS"/>
+        </w:rPr>
+        <w:t>Ako je motor konfiguracija poznata, onda dokaži da postoji ESC čija maksimalna struja je veća od maksimalne struje motora i čiji opseg broja ćelija je kompatibilan sa odabranom motor konfiguracijom</w:t>
+      </w:r>
+    </w:p>
+    <w:p>
+      <w:pPr>
+        <w:pStyle w:val="Compact"/>
+        <w:numPr>
+          <w:ilvl w:val="0"/>
+          <w:numId w:val="15"/>
+        </w:numPr>
+        <w:ind w:left="426" w:hanging="284"/>
+        <w:jc w:val="both"/>
+        <w:rPr>
+          <w:rFonts w:ascii="Roboto" w:hAnsi="Roboto"/>
+          <w:sz w:val="22"/>
+          <w:szCs w:val="22"/>
+          <w:lang w:val="sr-Latn-RS"/>
+        </w:rPr>
+      </w:pPr>
+      <w:r>
+        <w:rPr>
+          <w:rFonts w:ascii="Roboto" w:hAnsi="Roboto"/>
+          <w:sz w:val="22"/>
+          <w:szCs w:val="22"/>
+          <w:lang w:val="sr-Latn-RS"/>
+        </w:rPr>
+        <w:t xml:space="preserve">Ako je ESC poznat, onda dokaži da postoje </w:t>
+      </w:r>
+      <w:proofErr w:type="spellStart"/>
+      <w:r>
+        <w:rPr>
+          <w:rFonts w:ascii="Roboto" w:hAnsi="Roboto"/>
+          <w:sz w:val="22"/>
+          <w:szCs w:val="22"/>
+          <w:lang w:val="sr-Latn-RS"/>
+        </w:rPr>
+        <w:t>servoi</w:t>
+      </w:r>
+      <w:proofErr w:type="spellEnd"/>
+      <w:r>
+        <w:rPr>
+          <w:rFonts w:ascii="Roboto" w:hAnsi="Roboto"/>
+          <w:sz w:val="22"/>
+          <w:szCs w:val="22"/>
+          <w:lang w:val="sr-Latn-RS"/>
+        </w:rPr>
+        <w:t xml:space="preserve"> odgovarajuće kategorije veličine za dati model, uz poštovanje preferencije tipa zupčanika</w:t>
+      </w:r>
+    </w:p>
+    <w:p>
+      <w:pPr>
+        <w:pStyle w:val="Compact"/>
+        <w:numPr>
+          <w:ilvl w:val="0"/>
+          <w:numId w:val="15"/>
+        </w:numPr>
+        <w:ind w:left="426" w:hanging="284"/>
+        <w:jc w:val="both"/>
+        <w:rPr>
+          <w:rFonts w:ascii="Roboto" w:hAnsi="Roboto"/>
+          <w:sz w:val="22"/>
+          <w:szCs w:val="22"/>
+          <w:lang w:val="sr-Latn-RS"/>
+        </w:rPr>
+      </w:pPr>
+      <w:r>
+        <w:rPr>
+          <w:rFonts w:ascii="Roboto" w:hAnsi="Roboto"/>
+          <w:sz w:val="22"/>
+          <w:szCs w:val="22"/>
+          <w:lang w:val="sr-Latn-RS"/>
+        </w:rPr>
+        <w:t xml:space="preserve">Ako su </w:t>
+      </w:r>
+      <w:proofErr w:type="spellStart"/>
+      <w:r>
+        <w:rPr>
+          <w:rFonts w:ascii="Roboto" w:hAnsi="Roboto"/>
+          <w:sz w:val="22"/>
+          <w:szCs w:val="22"/>
+          <w:lang w:val="sr-Latn-RS"/>
+        </w:rPr>
+        <w:t>servoi</w:t>
+      </w:r>
+      <w:proofErr w:type="spellEnd"/>
+      <w:r>
+        <w:rPr>
+          <w:rFonts w:ascii="Roboto" w:hAnsi="Roboto"/>
+          <w:sz w:val="22"/>
+          <w:szCs w:val="22"/>
+          <w:lang w:val="sr-Latn-RS"/>
+        </w:rPr>
+        <w:t xml:space="preserve"> poznati, onda dokaži da postoji baterija čiji broj ćelija odgovara motor konfiguraciji, čija maksimalna izlazna struja pokriva ukupnu maksimalnu potrošnju modela i ima dovoljan kapacitet ako je zadato minimalno vreme letenja</w:t>
+      </w:r>
+    </w:p>
+    <w:p>
+      <w:pPr>
+        <w:pStyle w:val="Compact"/>
+        <w:numPr>
+          <w:ilvl w:val="0"/>
+          <w:numId w:val="15"/>
+        </w:numPr>
+        <w:ind w:left="426" w:hanging="284"/>
+        <w:jc w:val="both"/>
+        <w:rPr>
+          <w:rFonts w:ascii="Roboto" w:hAnsi="Roboto"/>
+          <w:sz w:val="22"/>
+          <w:szCs w:val="22"/>
+          <w:lang w:val="sr-Latn-RS"/>
+        </w:rPr>
+      </w:pPr>
+      <w:r>
+        <w:rPr>
+          <w:rFonts w:ascii="Roboto" w:hAnsi="Roboto"/>
+          <w:sz w:val="22"/>
+          <w:szCs w:val="22"/>
+          <w:lang w:val="sr-Latn-RS"/>
+        </w:rPr>
+        <w:t xml:space="preserve">Ako nije moguće dokazati postojanje ispravne kombinacije komponenti, onda vrati obrazloženje koji </w:t>
+      </w:r>
+      <w:proofErr w:type="spellStart"/>
+      <w:r>
+        <w:rPr>
+          <w:rFonts w:ascii="Roboto" w:hAnsi="Roboto"/>
+          <w:sz w:val="22"/>
+          <w:szCs w:val="22"/>
+          <w:lang w:val="sr-Latn-RS"/>
+        </w:rPr>
+        <w:t>podcilj</w:t>
+      </w:r>
+      <w:proofErr w:type="spellEnd"/>
+      <w:r>
+        <w:rPr>
+          <w:rFonts w:ascii="Roboto" w:hAnsi="Roboto"/>
+          <w:sz w:val="22"/>
+          <w:szCs w:val="22"/>
+          <w:lang w:val="sr-Latn-RS"/>
+        </w:rPr>
+        <w:t xml:space="preserve"> nije moguće ispuniti</w:t>
+      </w:r>
+    </w:p>
+    <w:p>
+      <w:pPr>
+        <w:pStyle w:val="FirstParagraph"/>
+        <w:jc w:val="both"/>
+        <w:rPr>
+          <w:rFonts w:ascii="Roboto" w:hAnsi="Roboto"/>
+          <w:sz w:val="22"/>
+          <w:szCs w:val="22"/>
+          <w:lang w:val="sr-Latn-RS"/>
+        </w:rPr>
+      </w:pPr>
+      <w:r>
+        <w:rPr>
+          <w:rFonts w:ascii="Roboto" w:hAnsi="Roboto"/>
+          <w:sz w:val="22"/>
+          <w:szCs w:val="22"/>
+          <w:lang w:val="sr-Latn-RS"/>
+        </w:rPr>
+        <w:t>Sistem može generisati različite validne kombinacije u zavisnosti od odabranog prioriteta — minimalna cena, minimalna težina, maksimalno vreme letenja ili maksimalni T/W faktor.</w:t>
+      </w:r>
+    </w:p>
+    <w:p>
+      <w:pPr>
+        <w:pStyle w:val="Heading4"/>
+        <w:spacing w:before="280"/>
+        <w:jc w:val="both"/>
+        <w:rPr>
+          <w:rFonts w:ascii="Roboto" w:hAnsi="Roboto"/>
+          <w:b/>
+          <w:bCs w:val="0"/>
+          <w:i w:val="0"/>
+          <w:color w:val="auto"/>
+          <w:sz w:val="22"/>
+          <w:szCs w:val="22"/>
+          <w:lang w:val="sr-Latn-RS"/>
+        </w:rPr>
+      </w:pPr>
+      <w:bookmarkStart w:id="11" w:name="cep"/>
+      <w:bookmarkEnd w:id="10"/>
+      <w:r>
+        <w:rPr>
+          <w:rFonts w:ascii="Roboto" w:hAnsi="Roboto"/>
+          <w:b/>
+          <w:bCs w:val="0"/>
+          <w:i w:val="0"/>
+          <w:color w:val="auto"/>
+          <w:sz w:val="22"/>
+          <w:szCs w:val="22"/>
+          <w:lang w:val="sr-Latn-RS"/>
+        </w:rPr>
         <w:t>3.3.4 CEP</w:t>
       </w:r>
     </w:p>
@@ -4170,7 +5405,101 @@
           <w:szCs w:val="22"/>
           <w:lang w:val="sr-Latn-RS"/>
         </w:rPr>
-        <w:t>Sistem periodično prikuplja i analizira vremensku prognozu. Svaki sat u prognozi se ocenjuje kao idealan, prihvatljiv ili neprikladan. Na osnovu zadatog trajanja termina i ocene za svaki sat prognoze, sistem predlaže najbolje termine za letenje. Korisnik može da odabere neki od ponuđenih termina i time označi da tada planira let. Sistem prati odabrane termine i vremensku prognozu, te na osnovu njih reaguje na sledeće događaje:</w:t>
+        <w:t>CEP podsistem reaguje na promene vremenskih uslova i akcije korisnika kako bi predložio termine za letenje, obavestio korisnika kada zakazani termin više nije prikladan i upozorio ga tokom samog leta. Ocen</w:t>
+      </w:r>
+      <w:r>
+        <w:rPr>
+          <w:rFonts w:ascii="Roboto" w:hAnsi="Roboto"/>
+          <w:sz w:val="22"/>
+          <w:szCs w:val="22"/>
+          <w:lang w:val="sr-Latn-RS"/>
+        </w:rPr>
+        <w:t xml:space="preserve">jivanje vremenskih uslova za konkretan model (idealan, prihvatljiv ili neprikladan), kao i pragovi prihvatljivosti vetra i temperature na kojima se ocene zasnivaju, definisani su pravilima trećeg nivoa </w:t>
+      </w:r>
+      <w:proofErr w:type="spellStart"/>
+      <w:r>
+        <w:rPr>
+          <w:rFonts w:ascii="Roboto" w:hAnsi="Roboto"/>
+          <w:sz w:val="22"/>
+          <w:szCs w:val="22"/>
+          <w:lang w:val="sr-Latn-RS"/>
+        </w:rPr>
+        <w:t>forward</w:t>
+      </w:r>
+      <w:proofErr w:type="spellEnd"/>
+      <w:r>
+        <w:rPr>
+          <w:rFonts w:ascii="Roboto" w:hAnsi="Roboto"/>
+          <w:sz w:val="22"/>
+          <w:szCs w:val="22"/>
+          <w:lang w:val="sr-Latn-RS"/>
+        </w:rPr>
+        <w:t xml:space="preserve"> </w:t>
+      </w:r>
+      <w:proofErr w:type="spellStart"/>
+      <w:r>
+        <w:rPr>
+          <w:rFonts w:ascii="Roboto" w:hAnsi="Roboto"/>
+          <w:sz w:val="22"/>
+          <w:szCs w:val="22"/>
+          <w:lang w:val="sr-Latn-RS"/>
+        </w:rPr>
+        <w:t>chaining</w:t>
+      </w:r>
+      <w:proofErr w:type="spellEnd"/>
+      <w:r>
+        <w:rPr>
+          <w:rFonts w:ascii="Roboto" w:hAnsi="Roboto"/>
+          <w:sz w:val="22"/>
+          <w:szCs w:val="22"/>
+          <w:lang w:val="sr-Latn-RS"/>
+        </w:rPr>
+        <w:t xml:space="preserve">-a. Sistem radi u STREAM režimu obrade događaja, jer pravila koriste vremenske operatore između </w:t>
+      </w:r>
+      <w:proofErr w:type="spellStart"/>
+      <w:r>
+        <w:rPr>
+          <w:rFonts w:ascii="Roboto" w:hAnsi="Roboto"/>
+          <w:sz w:val="22"/>
+          <w:szCs w:val="22"/>
+          <w:lang w:val="sr-Latn-RS"/>
+        </w:rPr>
+        <w:t>intervalnih</w:t>
+      </w:r>
+      <w:proofErr w:type="spellEnd"/>
+      <w:r>
+        <w:rPr>
+          <w:rFonts w:ascii="Roboto" w:hAnsi="Roboto"/>
+          <w:sz w:val="22"/>
+          <w:szCs w:val="22"/>
+          <w:lang w:val="sr-Latn-RS"/>
+        </w:rPr>
+        <w:t xml:space="preserve"> događaja toka prognoze i toka korisničkih akcija.</w:t>
+      </w:r>
+    </w:p>
+    <w:p>
+      <w:pPr>
+        <w:pStyle w:val="BodyText"/>
+        <w:spacing w:after="0"/>
+        <w:rPr>
+          <w:rFonts w:ascii="Roboto" w:hAnsi="Roboto"/>
+          <w:b/>
+          <w:bCs/>
+          <w:sz w:val="22"/>
+          <w:szCs w:val="22"/>
+          <w:lang w:val="sr-Latn-RS"/>
+        </w:rPr>
+      </w:pPr>
+      <w:r>
+        <w:rPr>
+          <w:rFonts w:ascii="Roboto" w:hAnsi="Roboto"/>
+          <w:b/>
+          <w:bCs/>
+          <w:sz w:val="22"/>
+          <w:szCs w:val="22"/>
+          <w:lang w:val="sr-Latn-RS"/>
+        </w:rPr>
+        <w:t>Ulazni događaji</w:t>
       </w:r>
     </w:p>
     <w:p>
@@ -4180,23 +5509,64 @@
           <w:ilvl w:val="0"/>
           <w:numId w:val="16"/>
         </w:numPr>
-        <w:ind w:left="426" w:hanging="284"/>
-        <w:jc w:val="both"/>
-        <w:rPr>
-          <w:rFonts w:ascii="Roboto" w:hAnsi="Roboto"/>
-          <w:sz w:val="22"/>
-          <w:szCs w:val="22"/>
-          <w:lang w:val="sr-Latn-RS"/>
-        </w:rPr>
-      </w:pPr>
-      <w:r>
-        <w:rPr>
-          <w:rFonts w:ascii="Roboto" w:hAnsi="Roboto"/>
-          <w:sz w:val="22"/>
-          <w:szCs w:val="22"/>
-          <w:lang w:val="sr-Latn-RS"/>
-        </w:rPr>
-        <w:t>Ako je odabrani termin sutra, onda podseti korisnika da se pripremi za let</w:t>
+        <w:spacing w:before="120"/>
+        <w:ind w:left="426" w:hanging="284"/>
+        <w:jc w:val="both"/>
+        <w:rPr>
+          <w:rFonts w:ascii="Roboto" w:hAnsi="Roboto"/>
+          <w:sz w:val="22"/>
+          <w:szCs w:val="22"/>
+          <w:lang w:val="sr-Latn-RS"/>
+        </w:rPr>
+      </w:pPr>
+      <w:r>
+        <w:rPr>
+          <w:rFonts w:ascii="Roboto" w:hAnsi="Roboto"/>
+          <w:sz w:val="22"/>
+          <w:szCs w:val="22"/>
+          <w:lang w:val="sr-Latn-RS"/>
+        </w:rPr>
+        <w:t xml:space="preserve">Sat prognoze — </w:t>
+      </w:r>
+      <w:proofErr w:type="spellStart"/>
+      <w:r>
+        <w:rPr>
+          <w:rFonts w:ascii="Roboto" w:hAnsi="Roboto"/>
+          <w:sz w:val="22"/>
+          <w:szCs w:val="22"/>
+          <w:lang w:val="sr-Latn-RS"/>
+        </w:rPr>
+        <w:t>intervalni</w:t>
+      </w:r>
+      <w:proofErr w:type="spellEnd"/>
+      <w:r>
+        <w:rPr>
+          <w:rFonts w:ascii="Roboto" w:hAnsi="Roboto"/>
+          <w:sz w:val="22"/>
+          <w:szCs w:val="22"/>
+          <w:lang w:val="sr-Latn-RS"/>
+        </w:rPr>
+        <w:t xml:space="preserve"> događaj iz toka prognoze, obuhvata jedan sat </w:t>
+      </w:r>
+      <w:proofErr w:type="spellStart"/>
+      <w:r>
+        <w:rPr>
+          <w:rFonts w:ascii="Roboto" w:hAnsi="Roboto"/>
+          <w:sz w:val="22"/>
+          <w:szCs w:val="22"/>
+          <w:lang w:val="sr-Latn-RS"/>
+        </w:rPr>
+        <w:t>predviđenih</w:t>
+      </w:r>
+      <w:proofErr w:type="spellEnd"/>
+      <w:r>
+        <w:rPr>
+          <w:rFonts w:ascii="Roboto" w:hAnsi="Roboto"/>
+          <w:sz w:val="22"/>
+          <w:szCs w:val="22"/>
+          <w:lang w:val="sr-Latn-RS"/>
+        </w:rPr>
+        <w:t xml:space="preserve"> uslova: temperaturu, vetar, padavine i deo dana</w:t>
       </w:r>
     </w:p>
     <w:p>
@@ -4222,7 +5592,96 @@
           <w:szCs w:val="22"/>
           <w:lang w:val="sr-Latn-RS"/>
         </w:rPr>
-        <w:t>Ako se prognoza osvežila i uslovi u odabranom terminu su se pogoršali, onda obavesti korisnika da termin više nije prikladan i predloži nove termine za letenje</w:t>
+        <w:t xml:space="preserve">Zakazani termin — </w:t>
+      </w:r>
+      <w:proofErr w:type="spellStart"/>
+      <w:r>
+        <w:rPr>
+          <w:rFonts w:ascii="Roboto" w:hAnsi="Roboto"/>
+          <w:sz w:val="22"/>
+          <w:szCs w:val="22"/>
+          <w:lang w:val="sr-Latn-RS"/>
+        </w:rPr>
+        <w:t>intervalni</w:t>
+      </w:r>
+      <w:proofErr w:type="spellEnd"/>
+      <w:r>
+        <w:rPr>
+          <w:rFonts w:ascii="Roboto" w:hAnsi="Roboto"/>
+          <w:sz w:val="22"/>
+          <w:szCs w:val="22"/>
+          <w:lang w:val="sr-Latn-RS"/>
+        </w:rPr>
+        <w:t xml:space="preserve"> događaj iz toka korisničkih akcija, obuhvata vreme u kome korisnik planira let za određeni model</w:t>
+      </w:r>
+    </w:p>
+    <w:p>
+      <w:pPr>
+        <w:pStyle w:val="Compact"/>
+        <w:spacing w:before="180" w:after="240"/>
+        <w:jc w:val="both"/>
+        <w:rPr>
+          <w:rFonts w:ascii="Roboto" w:hAnsi="Roboto"/>
+          <w:sz w:val="22"/>
+          <w:szCs w:val="22"/>
+          <w:lang w:val="sr-Latn-RS"/>
+        </w:rPr>
+      </w:pPr>
+      <w:r>
+        <w:rPr>
+          <w:rFonts w:ascii="Roboto" w:hAnsi="Roboto"/>
+          <w:sz w:val="22"/>
+          <w:szCs w:val="22"/>
+          <w:lang w:val="sr-Latn-RS"/>
+        </w:rPr>
+        <w:t>Pri svakom osvežavanju prognoze, prethodni sati prognoze za isti vremenski period zamenjuju se novima, automatski okidajući ponovno ocenjivanje svih pravila koja se na njih oslanjaju. Slično tome, kada korisnik otkaže let, zakazan termin se uklanja iz radne memorije, čime se gase sva pravila vezana za taj termin.</w:t>
+      </w:r>
+    </w:p>
+    <w:p>
+      <w:pPr>
+        <w:pStyle w:val="BodyText"/>
+        <w:spacing w:after="0"/>
+        <w:rPr>
+          <w:rFonts w:ascii="Roboto" w:hAnsi="Roboto"/>
+          <w:b/>
+          <w:bCs/>
+          <w:sz w:val="22"/>
+          <w:szCs w:val="22"/>
+          <w:lang w:val="sr-Latn-RS"/>
+        </w:rPr>
+      </w:pPr>
+      <w:r>
+        <w:rPr>
+          <w:rFonts w:ascii="Roboto" w:hAnsi="Roboto"/>
+          <w:b/>
+          <w:bCs/>
+          <w:sz w:val="22"/>
+          <w:szCs w:val="22"/>
+          <w:lang w:val="sr-Latn-RS"/>
+        </w:rPr>
+        <w:t>Pravila</w:t>
+      </w:r>
+    </w:p>
+    <w:p>
+      <w:pPr>
+        <w:pStyle w:val="Compact"/>
+        <w:spacing w:before="120"/>
+        <w:jc w:val="both"/>
+        <w:rPr>
+          <w:rFonts w:ascii="Roboto" w:hAnsi="Roboto"/>
+          <w:sz w:val="22"/>
+          <w:szCs w:val="22"/>
+          <w:lang w:val="sr-Latn-RS"/>
+        </w:rPr>
+      </w:pPr>
+      <w:r>
+        <w:rPr>
+          <w:rFonts w:ascii="Roboto" w:hAnsi="Roboto"/>
+          <w:sz w:val="22"/>
+          <w:szCs w:val="22"/>
+          <w:lang w:val="sr-Latn-RS"/>
+        </w:rPr>
+        <w:t>Svaki sat prognoze se na osnovu zadatog modela aviona ocenjuje kao idealan, prihvatljiv ili neprikladan. Na osnovu tih ocena, zakazanih termina i trenutnog vremena, sistem reaguje na sledeće situacije:</w:t>
       </w:r>
     </w:p>
     <w:p>
@@ -4232,48 +5691,106 @@
           <w:ilvl w:val="0"/>
           <w:numId w:val="16"/>
         </w:numPr>
-        <w:ind w:left="426" w:hanging="284"/>
-        <w:jc w:val="both"/>
-        <w:rPr>
-          <w:rFonts w:ascii="Roboto" w:hAnsi="Roboto"/>
-          <w:sz w:val="22"/>
-          <w:szCs w:val="22"/>
-          <w:lang w:val="sr-Latn-RS"/>
-        </w:rPr>
-      </w:pPr>
-      <w:r>
-        <w:rPr>
-          <w:rFonts w:ascii="Roboto" w:hAnsi="Roboto"/>
-          <w:sz w:val="22"/>
-          <w:szCs w:val="22"/>
-          <w:lang w:val="sr-Latn-RS"/>
-        </w:rPr>
-        <w:t>Ako se odabrani termin trenutno odvija i osvežena prognoza pokazuje naglo pogoršanje uslova u narednom periodu, onda upozori korisnika da završi let</w:t>
-      </w:r>
-    </w:p>
-    <w:p>
-      <w:pPr>
-        <w:pStyle w:val="Compact"/>
-        <w:ind w:left="720"/>
-        <w:jc w:val="both"/>
-        <w:rPr>
-          <w:rFonts w:ascii="Roboto" w:hAnsi="Roboto"/>
-          <w:sz w:val="22"/>
-          <w:szCs w:val="22"/>
-          <w:lang w:val="sr-Latn-RS"/>
-        </w:rPr>
-      </w:pPr>
+        <w:spacing w:before="180"/>
+        <w:ind w:left="426" w:hanging="284"/>
+        <w:jc w:val="both"/>
+        <w:rPr>
+          <w:rFonts w:ascii="Roboto" w:hAnsi="Roboto"/>
+          <w:sz w:val="22"/>
+          <w:szCs w:val="22"/>
+          <w:lang w:val="sr-Latn-RS"/>
+        </w:rPr>
+      </w:pPr>
+      <w:r>
+        <w:rPr>
+          <w:rFonts w:ascii="Roboto" w:hAnsi="Roboto"/>
+          <w:sz w:val="22"/>
+          <w:szCs w:val="22"/>
+          <w:lang w:val="sr-Latn-RS"/>
+        </w:rPr>
+        <w:t>Ako je termin sutra i podsetnik još nije poslat, onda obavesti korisnika da se pripremi za let</w:t>
+      </w:r>
+    </w:p>
+    <w:p>
+      <w:pPr>
+        <w:pStyle w:val="Compact"/>
+        <w:numPr>
+          <w:ilvl w:val="0"/>
+          <w:numId w:val="16"/>
+        </w:numPr>
+        <w:ind w:left="426" w:hanging="284"/>
+        <w:jc w:val="both"/>
+        <w:rPr>
+          <w:rFonts w:ascii="Roboto" w:hAnsi="Roboto"/>
+          <w:sz w:val="22"/>
+          <w:szCs w:val="22"/>
+          <w:lang w:val="sr-Latn-RS"/>
+        </w:rPr>
+      </w:pPr>
+      <w:r>
+        <w:rPr>
+          <w:rFonts w:ascii="Roboto" w:hAnsi="Roboto"/>
+          <w:sz w:val="22"/>
+          <w:szCs w:val="22"/>
+          <w:lang w:val="sr-Latn-RS"/>
+        </w:rPr>
+        <w:t>Ako bar jedan sat unutar zakazanog termina postane neprikladan, onda obavesti korisnika da termin više nije prikladan i predloži nove termine</w:t>
+      </w:r>
+    </w:p>
+    <w:p>
+      <w:pPr>
+        <w:pStyle w:val="Compact"/>
+        <w:numPr>
+          <w:ilvl w:val="0"/>
+          <w:numId w:val="16"/>
+        </w:numPr>
+        <w:ind w:left="426" w:hanging="284"/>
+        <w:jc w:val="both"/>
+        <w:rPr>
+          <w:rFonts w:ascii="Roboto" w:hAnsi="Roboto"/>
+          <w:sz w:val="22"/>
+          <w:szCs w:val="22"/>
+          <w:lang w:val="sr-Latn-RS"/>
+        </w:rPr>
+      </w:pPr>
+      <w:r>
+        <w:rPr>
+          <w:rFonts w:ascii="Roboto" w:hAnsi="Roboto"/>
+          <w:sz w:val="22"/>
+          <w:szCs w:val="22"/>
+          <w:lang w:val="sr-Latn-RS"/>
+        </w:rPr>
+        <w:t>Ak</w:t>
+      </w:r>
+      <w:r>
+        <w:rPr>
+          <w:rFonts w:ascii="Roboto" w:hAnsi="Roboto"/>
+          <w:sz w:val="22"/>
+          <w:szCs w:val="22"/>
+          <w:lang w:val="sr-Latn-RS"/>
+        </w:rPr>
+        <w:t xml:space="preserve">o trenutno vreme upada unutar zakazanog termina i bar jedan od naredna dva sata prognoze je neprikladan, onda upozori korisnika da završi </w:t>
+      </w:r>
+      <w:r>
+        <w:rPr>
+          <w:rFonts w:ascii="Roboto" w:hAnsi="Roboto"/>
+          <w:sz w:val="22"/>
+          <w:szCs w:val="22"/>
+          <w:lang w:val="sr-Latn-RS"/>
+        </w:rPr>
+        <w:t>let</w:t>
+      </w:r>
     </w:p>
     <w:p>
       <w:pPr>
         <w:pStyle w:val="Heading2"/>
-        <w:spacing w:before="240" w:after="240"/>
+        <w:spacing w:before="0"/>
         <w:jc w:val="both"/>
         <w:rPr>
           <w:rFonts w:ascii="Roboto" w:hAnsi="Roboto"/>
           <w:color w:val="auto"/>
-          <w:sz w:val="24"/>
-          <w:szCs w:val="24"/>
+          <w:sz w:val="22"/>
+          <w:szCs w:val="22"/>
           <w:lang w:val="sr-Latn-RS"/>
         </w:rPr>
       </w:pPr>
@@ -4281,6 +5798,52 @@
       <w:bookmarkEnd w:id="4"/>
       <w:bookmarkEnd w:id="7"/>
       <w:bookmarkEnd w:id="11"/>
+      <w:r>
+        <w:rPr>
+          <w:rFonts w:ascii="Roboto" w:hAnsi="Roboto"/>
+          <w:color w:val="auto"/>
+          <w:sz w:val="22"/>
+          <w:szCs w:val="22"/>
+          <w:lang w:val="sr-Latn-RS"/>
+        </w:rPr>
+        <w:lastRenderedPageBreak/>
+        <w:t>Upit za predlog termina</w:t>
+      </w:r>
+    </w:p>
+    <w:p>
+      <w:pPr>
+        <w:pStyle w:val="BodyText"/>
+        <w:spacing w:before="120"/>
+        <w:rPr>
+          <w:rFonts w:ascii="Roboto" w:hAnsi="Roboto"/>
+          <w:sz w:val="22"/>
+          <w:szCs w:val="22"/>
+          <w:lang w:val="sr-Latn-RS"/>
+        </w:rPr>
+      </w:pPr>
+      <w:r>
+        <w:rPr>
+          <w:rFonts w:ascii="Roboto" w:hAnsi="Roboto"/>
+          <w:sz w:val="22"/>
+          <w:szCs w:val="22"/>
+          <w:lang w:val="sr-Latn-RS"/>
+        </w:rPr>
+        <w:t>Predlozi termina formiraju se na zahtev, traženjem uzastopnih sati u prognozi koji pokrivaju zadato trajanje termina i ne sadrže nijedan neprikladan sat, rangirano po broju idealnih sati.</w:t>
+      </w:r>
+    </w:p>
+    <w:p>
+      <w:pPr>
+        <w:pStyle w:val="Heading2"/>
+        <w:spacing w:before="240" w:after="240"/>
+        <w:jc w:val="both"/>
+        <w:rPr>
+          <w:rFonts w:ascii="Roboto" w:hAnsi="Roboto"/>
+          <w:color w:val="auto"/>
+          <w:sz w:val="24"/>
+          <w:szCs w:val="24"/>
+          <w:lang w:val="sr-Latn-RS"/>
+        </w:rPr>
+      </w:pPr>
       <w:r>
         <w:rPr>
           <w:rFonts w:ascii="Roboto" w:hAnsi="Roboto"/>
@@ -5631,6 +7194,7 @@
   <w:style w:type="paragraph" w:styleId="BodyText">
     <w:name w:val="Body Text"/>
     <w:basedOn w:val="Normal"/>
+    <w:link w:val="BodyTextChar"/>
     <w:qFormat/>
     <w:pPr>
       <w:spacing w:before="180" w:after="180"/>
@@ -6235,6 +7799,21 @@
     <w:link w:val="Footer"/>
     <w:rsid w:val="00B71E34"/>
   </w:style>
+  <w:style w:type="paragraph" w:styleId="ListParagraph">
+    <w:name w:val="List Paragraph"/>
+    <w:basedOn w:val="Normal"/>
+    <w:rsid w:val="00DF2D63"/>
+    <w:pPr>
+      <w:ind w:left="720"/>
+      <w:contextualSpacing/>
+    </w:pPr>
+  </w:style>
+  <w:style w:type="character" w:customStyle="1" w:styleId="BodyTextChar">
+    <w:name w:val="Body Text Char"/>
+    <w:basedOn w:val="DefaultParagraphFont"/>
+    <w:link w:val="BodyText"/>
+    <w:rsid w:val="009678B7"/>
+  </w:style>
 </w:styles>
 </file>
 

</xml_diff>

<commit_message>
feat: fc lvl3, cep and frontend
</commit_message>
<xml_diff>
--- a/predlog_projekta/FlightForge.docx
+++ b/predlog_projekta/FlightForge.docx
@@ -769,7 +769,27 @@
           <w:szCs w:val="22"/>
           <w:lang w:val="sr-Latn-RS"/>
         </w:rPr>
-        <w:t xml:space="preserve"> modela (skaliranje dužine i širine, ne površine)</w:t>
+        <w:t xml:space="preserve"> modela (</w:t>
+      </w:r>
+      <w:proofErr w:type="spellStart"/>
+      <w:r>
+        <w:rPr>
+          <w:rFonts w:ascii="Roboto" w:hAnsi="Roboto"/>
+          <w:sz w:val="22"/>
+          <w:szCs w:val="22"/>
+          <w:lang w:val="sr-Latn-RS"/>
+        </w:rPr>
+        <w:t>skaliranje</w:t>
+      </w:r>
+      <w:proofErr w:type="spellEnd"/>
+      <w:r>
+        <w:rPr>
+          <w:rFonts w:ascii="Roboto" w:hAnsi="Roboto"/>
+          <w:sz w:val="22"/>
+          <w:szCs w:val="22"/>
+          <w:lang w:val="sr-Latn-RS"/>
+        </w:rPr>
+        <w:t xml:space="preserve"> dužine i širine, ne površine)</w:t>
       </w:r>
     </w:p>
     <w:p>
@@ -2879,14 +2899,25 @@
           <w:lang w:val="sr-Latn-RS"/>
         </w:rPr>
       </w:pPr>
-      <w:r>
-        <w:rPr>
-          <w:rFonts w:ascii="Roboto" w:hAnsi="Roboto"/>
-          <w:sz w:val="22"/>
-          <w:szCs w:val="22"/>
-          <w:lang w:val="sr-Latn-RS"/>
-        </w:rPr>
-        <w:t>burst struja — maksimalna struja koju ESC može kratkotrajno da podnese</w:t>
+      <w:proofErr w:type="spellStart"/>
+      <w:r>
+        <w:rPr>
+          <w:rFonts w:ascii="Roboto" w:hAnsi="Roboto"/>
+          <w:sz w:val="22"/>
+          <w:szCs w:val="22"/>
+          <w:lang w:val="sr-Latn-RS"/>
+        </w:rPr>
+        <w:t>burst</w:t>
+      </w:r>
+      <w:proofErr w:type="spellEnd"/>
+      <w:r>
+        <w:rPr>
+          <w:rFonts w:ascii="Roboto" w:hAnsi="Roboto"/>
+          <w:sz w:val="22"/>
+          <w:szCs w:val="22"/>
+          <w:lang w:val="sr-Latn-RS"/>
+        </w:rPr>
+        <w:t xml:space="preserve"> struja — maksimalna struja koju ESC može kratkotrajno da podnese</w:t>
       </w:r>
     </w:p>
     <w:p>
@@ -5141,7 +5172,7 @@
           <w:szCs w:val="22"/>
           <w:lang w:val="sr-Latn-RS"/>
         </w:rPr>
-        <w:t>Kada korisnik zatraži automatski predlog kombinacije komponenti, sistem unazad dokazuje da za odabrani model postoji ispravna kombinacija komponenti. Komponente koje su nedostupne sistem ne uzima u obzir pri pretrazi, ali korisnik ih može ručno odabrati. Korisnik može zaključati određene komponente, u tom slučaju sistem te komponente ne bira automatski već njima prilagođava izbor ostalih komponenti.</w:t>
+        <w:t xml:space="preserve">Kada korisnik zatraži automatski predlog kombinacije komponenti, sistem unazad dokazuje da za odabrani model postoji ispravna kombinacija komponenti. Komponente koje su nedostupne sistem ne uzima u obzir pri pretrazi, ali korisnik ih može ručno odabrati. </w:t>
       </w:r>
     </w:p>
     <w:p>
@@ -6242,8 +6273,6 @@
         <w:fldChar w:fldCharType="end"/>
       </w:r>
     </w:p>
-    <w:bookmarkStart w:id="21" w:name="fn-5-dea5cd39cc0fc98c"/>
-    <w:bookmarkEnd w:id="19"/>
     <w:p>
       <w:pPr>
         <w:numPr>
@@ -6263,7 +6292,108 @@
           <w:lang w:val="sr-Latn-RS"/>
         </w:rPr>
       </w:pPr>
-      <w:r>
+      <w:bookmarkStart w:id="21" w:name="fn-5-dea5cd39cc0fc98c"/>
+      <w:bookmarkEnd w:id="19"/>
+      <w:r>
+        <w:rPr>
+          <w:rFonts w:ascii="Roboto" w:hAnsi="Roboto"/>
+          <w:i/>
+          <w:iCs/>
+          <w:noProof/>
+          <w:sz w:val="20"/>
+          <w:szCs w:val="20"/>
+          <w:u w:val="single"/>
+          <w:lang w:val="sr-Latn-RS"/>
+        </w:rPr>
+        <w:drawing>
+          <wp:anchor distT="0" distB="0" distL="114300" distR="114300" simplePos="0" relativeHeight="251658240" behindDoc="0" locked="0" layoutInCell="1" allowOverlap="1" wp14:anchorId="62269317" wp14:editId="635F5F26">
+            <wp:simplePos x="0" y="0"/>
+            <wp:positionH relativeFrom="margin">
+              <wp:posOffset>-387985</wp:posOffset>
+            </wp:positionH>
+            <wp:positionV relativeFrom="margin">
+              <wp:posOffset>2258695</wp:posOffset>
+            </wp:positionV>
+            <wp:extent cx="6960235" cy="7089775"/>
+            <wp:effectExtent l="0" t="0" r="0" b="0"/>
+            <wp:wrapNone/>
+            <wp:docPr id="838031073" name="Picture 2"/>
+            <wp:cNvGraphicFramePr>
+              <a:graphicFrameLocks xmlns:a="http://schemas.openxmlformats.org/drawingml/2006/main" noChangeAspect="1"/>
+            </wp:cNvGraphicFramePr>
+            <a:graphic xmlns:a="http://schemas.openxmlformats.org/drawingml/2006/main">
+              <a:graphicData uri="http://schemas.openxmlformats.org/drawingml/2006/picture">
+                <pic:pic xmlns:pic="http://schemas.openxmlformats.org/drawingml/2006/picture">
+                  <pic:nvPicPr>
+                    <pic:cNvPr id="0" name="Picture 2"/>
+                    <pic:cNvPicPr>
+                      <a:picLocks noChangeAspect="1" noChangeArrowheads="1"/>
+                    </pic:cNvPicPr>
+                  </pic:nvPicPr>
+                  <pic:blipFill>
+                    <a:blip r:embed="rId8" cstate="print">
+                      <a:extLst>
+                        <a:ext uri="{28A0092B-C50C-407E-A947-70E740481C1C}">
+                          <a14:useLocalDpi xmlns:a14="http://schemas.microsoft.com/office/drawing/2010/main" val="0"/>
+                        </a:ext>
+                      </a:extLst>
+                    </a:blip>
+                    <a:srcRect/>
+                    <a:stretch>
+                      <a:fillRect/>
+                    </a:stretch>
+                  </pic:blipFill>
+                  <pic:spPr bwMode="auto">
+                    <a:xfrm>
+                      <a:off x="0" y="0"/>
+                      <a:ext cx="6960235" cy="7089775"/>
+                    </a:xfrm>
+                    <a:prstGeom prst="rect">
+                      <a:avLst/>
+                    </a:prstGeom>
+                    <a:noFill/>
+                    <a:ln>
+                      <a:noFill/>
+                    </a:ln>
+                  </pic:spPr>
+                </pic:pic>
+              </a:graphicData>
+            </a:graphic>
+            <wp14:sizeRelH relativeFrom="margin">
+              <wp14:pctWidth>0</wp14:pctWidth>
+            </wp14:sizeRelH>
+            <wp14:sizeRelV relativeFrom="margin">
+              <wp14:pctHeight>0</wp14:pctHeight>
+            </wp14:sizeRelV>
+          </wp:anchor>
+        </w:drawing>
+      </w:r>
+      <w:hyperlink r:id="rId9">
+        <w:bookmarkStart w:id="22" w:name="_Ref228380389"/>
+        <w:r>
+          <w:rPr>
+            <w:rStyle w:val="Hyperlink"/>
+            <w:rFonts w:ascii="Roboto" w:hAnsi="Roboto"/>
+            <w:i/>
+            <w:iCs/>
+            <w:color w:val="auto"/>
+            <w:sz w:val="20"/>
+            <w:szCs w:val="20"/>
+            <w:u w:val="single"/>
+            <w:lang w:val="sr-Latn-RS"/>
+          </w:rPr>
+          <w:t>https://hobbyking.com</w:t>
+        </w:r>
+        <w:bookmarkEnd w:id="22"/>
+      </w:hyperlink>
+      <w:bookmarkEnd w:id="0"/>
+      <w:bookmarkEnd w:id="12"/>
+      <w:bookmarkEnd w:id="21"/>
+    </w:p>
+    <w:p>
+      <w:pPr>
+        <w:spacing w:after="120"/>
+        <w:jc w:val="both"/>
         <w:rPr>
           <w:rFonts w:ascii="Roboto" w:hAnsi="Roboto"/>
           <w:i/>
@@ -6273,9 +6403,12 @@
           <w:u w:val="single"/>
           <w:lang w:val="sr-Latn-RS"/>
         </w:rPr>
-        <w:fldChar w:fldCharType="begin"/>
-      </w:r>
-      <w:r>
+      </w:pPr>
+    </w:p>
+    <w:p>
+      <w:pPr>
+        <w:spacing w:after="120"/>
+        <w:jc w:val="both"/>
         <w:rPr>
           <w:rFonts w:ascii="Roboto" w:hAnsi="Roboto"/>
           <w:i/>
@@ -6285,62 +6418,7 @@
           <w:u w:val="single"/>
           <w:lang w:val="sr-Latn-RS"/>
         </w:rPr>
-        <w:instrText>HYPERLINK "https://hobbyking.com" \h</w:instrText>
-      </w:r>
-      <w:r>
-        <w:rPr>
-          <w:rFonts w:ascii="Roboto" w:hAnsi="Roboto"/>
-          <w:i/>
-          <w:iCs/>
-          <w:sz w:val="20"/>
-          <w:szCs w:val="20"/>
-          <w:u w:val="single"/>
-          <w:lang w:val="sr-Latn-RS"/>
-        </w:rPr>
-      </w:r>
-      <w:r>
-        <w:rPr>
-          <w:rFonts w:ascii="Roboto" w:hAnsi="Roboto"/>
-          <w:i/>
-          <w:iCs/>
-          <w:sz w:val="20"/>
-          <w:szCs w:val="20"/>
-          <w:u w:val="single"/>
-          <w:lang w:val="sr-Latn-RS"/>
-        </w:rPr>
-        <w:fldChar w:fldCharType="separate"/>
-      </w:r>
-      <w:bookmarkStart w:id="22" w:name="_Ref228380389"/>
-      <w:r>
-        <w:rPr>
-          <w:rStyle w:val="Hyperlink"/>
-          <w:rFonts w:ascii="Roboto" w:hAnsi="Roboto"/>
-          <w:i/>
-          <w:iCs/>
-          <w:color w:val="auto"/>
-          <w:sz w:val="20"/>
-          <w:szCs w:val="20"/>
-          <w:u w:val="single"/>
-          <w:lang w:val="sr-Latn-RS"/>
-        </w:rPr>
-        <w:t>https://hobbyking.com</w:t>
-      </w:r>
-      <w:bookmarkEnd w:id="22"/>
-      <w:r>
-        <w:rPr>
-          <w:rFonts w:ascii="Roboto" w:hAnsi="Roboto"/>
-          <w:i/>
-          <w:iCs/>
-          <w:sz w:val="20"/>
-          <w:szCs w:val="20"/>
-          <w:u w:val="single"/>
-          <w:lang w:val="sr-Latn-RS"/>
-        </w:rPr>
-        <w:fldChar w:fldCharType="end"/>
-      </w:r>
-      <w:bookmarkEnd w:id="0"/>
-      <w:bookmarkEnd w:id="12"/>
-      <w:bookmarkEnd w:id="21"/>
+      </w:pPr>
     </w:p>
     <w:sectPr>
       <w:pgSz w:w="11906" w:h="16838" w:code="9"/>

</xml_diff>